<commit_message>
Lebenslauf ATS v5 — vollständige Zeitlinie, getrennte Bereiche
</commit_message>
<xml_diff>
--- a/Lebenslauf_Andre_Schwarz_DE.docx
+++ b/Lebenslauf_Andre_Schwarz_DE.docx
@@ -116,7 +116,7 @@
           <w:sz w:val="18"/>
           <w:szCs w:val="18"/>
         </w:rPr>
-        <w:t xml:space="preserve">06/2026 – heute</w:t>
+        <w:t xml:space="preserve">2022 – heute</w:t>
       </w:r>
       <w:r>
         <w:rPr>
@@ -136,7 +136,7 @@
           <w:sz w:val="20"/>
           <w:szCs w:val="20"/>
         </w:rPr>
-        <w:t xml:space="preserve">Co-Founder &amp; Copywriter</w:t>
+        <w:t xml:space="preserve">Empfangsmitarbeiter (ungekündigt)</w:t>
       </w:r>
     </w:p>
     <w:p>
@@ -153,76 +153,99 @@
           <w:sz w:val="18"/>
           <w:szCs w:val="18"/>
         </w:rPr>
-        <w:t xml:space="preserve">Copy Code Agency · mit Tomasz Szafrański · copy.code.agency</w:t>
-      </w:r>
-    </w:p>
-    <w:p>
-      <w:pPr>
-        <w:spacing w:after="36"/>
-      </w:pPr>
-      <w:r>
-        <w:rPr>
-          <w:rFonts w:ascii="Arial" w:cs="Arial" w:eastAsia="Arial" w:hAnsi="Arial"/>
-          <w:color w:val="666666"/>
-          <w:sz w:val="20"/>
-          <w:szCs w:val="20"/>
-        </w:rPr>
-        <w:t xml:space="preserve">· </w:t>
-      </w:r>
-      <w:r>
-        <w:rPr>
-          <w:rFonts w:ascii="Arial" w:cs="Arial" w:eastAsia="Arial" w:hAnsi="Arial"/>
-          <w:color w:val="1A1A1A"/>
-          <w:sz w:val="19"/>
-          <w:szCs w:val="19"/>
-        </w:rPr>
-        <w:t xml:space="preserve">Conversion Copy, Brand &amp; SEO für drei digitale Produkte in der Startphase</w:t>
-      </w:r>
-    </w:p>
-    <w:p>
-      <w:pPr>
-        <w:spacing w:after="36"/>
-      </w:pPr>
-      <w:r>
-        <w:rPr>
-          <w:rFonts w:ascii="Arial" w:cs="Arial" w:eastAsia="Arial" w:hAnsi="Arial"/>
-          <w:color w:val="666666"/>
-          <w:sz w:val="20"/>
-          <w:szCs w:val="20"/>
-        </w:rPr>
-        <w:t xml:space="preserve">· </w:t>
-      </w:r>
-      <w:r>
-        <w:rPr>
-          <w:rFonts w:ascii="Arial" w:cs="Arial" w:eastAsia="Arial" w:hAnsi="Arial"/>
-          <w:color w:val="1A1A1A"/>
-          <w:sz w:val="19"/>
-          <w:szCs w:val="19"/>
-        </w:rPr>
-        <w:t xml:space="preserve">KI-CV-Optimizer, Value Bet SaaS, IT-Recruiting-Plattform · Frankfurt → Remote</w:t>
-      </w:r>
-    </w:p>
-    <w:p>
-      <w:pPr>
-        <w:spacing w:after="36"/>
-      </w:pPr>
-      <w:r>
-        <w:rPr>
-          <w:rFonts w:ascii="Arial" w:cs="Arial" w:eastAsia="Arial" w:hAnsi="Arial"/>
-          <w:color w:val="666666"/>
-          <w:sz w:val="20"/>
-          <w:szCs w:val="20"/>
-        </w:rPr>
-        <w:t xml:space="preserve">· </w:t>
-      </w:r>
-      <w:r>
-        <w:rPr>
-          <w:rFonts w:ascii="Arial" w:cs="Arial" w:eastAsia="Arial" w:hAnsi="Arial"/>
-          <w:color w:val="1A1A1A"/>
-          <w:sz w:val="19"/>
-          <w:szCs w:val="19"/>
-        </w:rPr>
-        <w:t xml:space="preserve">Verkaufsfunnel, Landing Pages und Produkt-Texte eigenständig entwickelt</w:t>
+        <w:t xml:space="preserve">Turmhotel Frankfurt am Main</w:t>
+      </w:r>
+    </w:p>
+    <w:p>
+      <w:pPr>
+        <w:spacing w:after="36"/>
+      </w:pPr>
+      <w:r>
+        <w:rPr>
+          <w:rFonts w:ascii="Arial" w:cs="Arial" w:eastAsia="Arial" w:hAnsi="Arial"/>
+          <w:color w:val="666666"/>
+          <w:sz w:val="20"/>
+          <w:szCs w:val="20"/>
+        </w:rPr>
+        <w:t xml:space="preserve">· </w:t>
+      </w:r>
+      <w:r>
+        <w:rPr>
+          <w:rFonts w:ascii="Arial" w:cs="Arial" w:eastAsia="Arial" w:hAnsi="Arial"/>
+          <w:color w:val="1A1A1A"/>
+          <w:sz w:val="19"/>
+          <w:szCs w:val="19"/>
+        </w:rPr>
+        <w:t xml:space="preserve">Internationale Gästekommunikation auf Deutsch und Englisch</w:t>
+      </w:r>
+    </w:p>
+    <w:p>
+      <w:pPr>
+        <w:spacing w:after="36"/>
+      </w:pPr>
+      <w:r>
+        <w:rPr>
+          <w:rFonts w:ascii="Arial" w:cs="Arial" w:eastAsia="Arial" w:hAnsi="Arial"/>
+          <w:color w:val="666666"/>
+          <w:sz w:val="20"/>
+          <w:szCs w:val="20"/>
+        </w:rPr>
+        <w:t xml:space="preserve">· </w:t>
+      </w:r>
+      <w:r>
+        <w:rPr>
+          <w:rFonts w:ascii="Arial" w:cs="Arial" w:eastAsia="Arial" w:hAnsi="Arial"/>
+          <w:color w:val="1A1A1A"/>
+          <w:sz w:val="19"/>
+          <w:szCs w:val="19"/>
+        </w:rPr>
+        <w:t xml:space="preserve">Parallelbearbeitung mehrerer Buchungsplattformen unter Zeitdruck</w:t>
+      </w:r>
+    </w:p>
+    <w:p>
+      <w:pPr>
+        <w:spacing w:after="36"/>
+      </w:pPr>
+      <w:r>
+        <w:rPr>
+          <w:rFonts w:ascii="Arial" w:cs="Arial" w:eastAsia="Arial" w:hAnsi="Arial"/>
+          <w:color w:val="666666"/>
+          <w:sz w:val="20"/>
+          <w:szCs w:val="20"/>
+        </w:rPr>
+        <w:t xml:space="preserve">· </w:t>
+      </w:r>
+      <w:r>
+        <w:rPr>
+          <w:rFonts w:ascii="Arial" w:cs="Arial" w:eastAsia="Arial" w:hAnsi="Arial"/>
+          <w:color w:val="1A1A1A"/>
+          <w:sz w:val="19"/>
+          <w:szCs w:val="19"/>
+        </w:rPr>
+        <w:t xml:space="preserve">Willkommensbuch in über 30 Sprachen eigeninitiativ verfasst</w:t>
+      </w:r>
+    </w:p>
+    <w:p>
+      <w:pPr>
+        <w:spacing w:after="36"/>
+      </w:pPr>
+      <w:r>
+        <w:rPr>
+          <w:rFonts w:ascii="Arial" w:cs="Arial" w:eastAsia="Arial" w:hAnsi="Arial"/>
+          <w:color w:val="666666"/>
+          <w:sz w:val="20"/>
+          <w:szCs w:val="20"/>
+        </w:rPr>
+        <w:t xml:space="preserve">· </w:t>
+      </w:r>
+      <w:r>
+        <w:rPr>
+          <w:rFonts w:ascii="Arial" w:cs="Arial" w:eastAsia="Arial" w:hAnsi="Arial"/>
+          <w:color w:val="1A1A1A"/>
+          <w:sz w:val="19"/>
+          <w:szCs w:val="19"/>
+        </w:rPr>
+        <w:t xml:space="preserve">Digitalisierungskonzept für den Hotelbetrieb mitentwickelt</w:t>
       </w:r>
     </w:p>
     <w:p>
@@ -237,7 +260,7 @@
           <w:sz w:val="18"/>
           <w:szCs w:val="18"/>
         </w:rPr>
-        <w:t xml:space="preserve">2022 – heute</w:t>
+        <w:t xml:space="preserve">2018 – 2021</w:t>
       </w:r>
       <w:r>
         <w:rPr>
@@ -257,7 +280,7 @@
           <w:sz w:val="20"/>
           <w:szCs w:val="20"/>
         </w:rPr>
-        <w:t xml:space="preserve">Empfangsmitarbeiter (ungekündigt)</w:t>
+        <w:t xml:space="preserve">Sicherheitsmitarbeiter</w:t>
       </w:r>
     </w:p>
     <w:p>
@@ -274,99 +297,30 @@
           <w:sz w:val="18"/>
           <w:szCs w:val="18"/>
         </w:rPr>
-        <w:t xml:space="preserve">Turmhotel Frankfurt am Main</w:t>
-      </w:r>
-    </w:p>
-    <w:p>
-      <w:pPr>
-        <w:spacing w:after="36"/>
-      </w:pPr>
-      <w:r>
-        <w:rPr>
-          <w:rFonts w:ascii="Arial" w:cs="Arial" w:eastAsia="Arial" w:hAnsi="Arial"/>
-          <w:color w:val="666666"/>
-          <w:sz w:val="20"/>
-          <w:szCs w:val="20"/>
-        </w:rPr>
-        <w:t xml:space="preserve">· </w:t>
-      </w:r>
-      <w:r>
-        <w:rPr>
-          <w:rFonts w:ascii="Arial" w:cs="Arial" w:eastAsia="Arial" w:hAnsi="Arial"/>
-          <w:color w:val="1A1A1A"/>
-          <w:sz w:val="19"/>
-          <w:szCs w:val="19"/>
-        </w:rPr>
-        <w:t xml:space="preserve">Internationale Gästekommunikation auf Deutsch und Englisch</w:t>
-      </w:r>
-    </w:p>
-    <w:p>
-      <w:pPr>
-        <w:spacing w:after="36"/>
-      </w:pPr>
-      <w:r>
-        <w:rPr>
-          <w:rFonts w:ascii="Arial" w:cs="Arial" w:eastAsia="Arial" w:hAnsi="Arial"/>
-          <w:color w:val="666666"/>
-          <w:sz w:val="20"/>
-          <w:szCs w:val="20"/>
-        </w:rPr>
-        <w:t xml:space="preserve">· </w:t>
-      </w:r>
-      <w:r>
-        <w:rPr>
-          <w:rFonts w:ascii="Arial" w:cs="Arial" w:eastAsia="Arial" w:hAnsi="Arial"/>
-          <w:color w:val="1A1A1A"/>
-          <w:sz w:val="19"/>
-          <w:szCs w:val="19"/>
-        </w:rPr>
-        <w:t xml:space="preserve">Parallelbearbeitung mehrerer Buchungsplattformen unter Zeitdruck</w:t>
-      </w:r>
-    </w:p>
-    <w:p>
-      <w:pPr>
-        <w:spacing w:after="36"/>
-      </w:pPr>
-      <w:r>
-        <w:rPr>
-          <w:rFonts w:ascii="Arial" w:cs="Arial" w:eastAsia="Arial" w:hAnsi="Arial"/>
-          <w:color w:val="666666"/>
-          <w:sz w:val="20"/>
-          <w:szCs w:val="20"/>
-        </w:rPr>
-        <w:t xml:space="preserve">· </w:t>
-      </w:r>
-      <w:r>
-        <w:rPr>
-          <w:rFonts w:ascii="Arial" w:cs="Arial" w:eastAsia="Arial" w:hAnsi="Arial"/>
-          <w:color w:val="1A1A1A"/>
-          <w:sz w:val="19"/>
-          <w:szCs w:val="19"/>
-        </w:rPr>
-        <w:t xml:space="preserve">Willkommensbuch in über 30 Sprachen eigeninitiativ verfasst</w:t>
-      </w:r>
-    </w:p>
-    <w:p>
-      <w:pPr>
-        <w:spacing w:after="36"/>
-      </w:pPr>
-      <w:r>
-        <w:rPr>
-          <w:rFonts w:ascii="Arial" w:cs="Arial" w:eastAsia="Arial" w:hAnsi="Arial"/>
-          <w:color w:val="666666"/>
-          <w:sz w:val="20"/>
-          <w:szCs w:val="20"/>
-        </w:rPr>
-        <w:t xml:space="preserve">· </w:t>
-      </w:r>
-      <w:r>
-        <w:rPr>
-          <w:rFonts w:ascii="Arial" w:cs="Arial" w:eastAsia="Arial" w:hAnsi="Arial"/>
-          <w:color w:val="1A1A1A"/>
-          <w:sz w:val="19"/>
-          <w:szCs w:val="19"/>
-        </w:rPr>
-        <w:t xml:space="preserve">Digitalisierungskonzept für den Hotelbetrieb mitentwickelt</w:t>
+        <w:t xml:space="preserve">LAWS Dienstleistungs- und Servicemanagement, Florstadt</w:t>
+      </w:r>
+    </w:p>
+    <w:p>
+      <w:pPr>
+        <w:spacing w:after="36"/>
+      </w:pPr>
+      <w:r>
+        <w:rPr>
+          <w:rFonts w:ascii="Arial" w:cs="Arial" w:eastAsia="Arial" w:hAnsi="Arial"/>
+          <w:color w:val="666666"/>
+          <w:sz w:val="20"/>
+          <w:szCs w:val="20"/>
+        </w:rPr>
+        <w:t xml:space="preserve">· </w:t>
+      </w:r>
+      <w:r>
+        <w:rPr>
+          <w:rFonts w:ascii="Arial" w:cs="Arial" w:eastAsia="Arial" w:hAnsi="Arial"/>
+          <w:color w:val="1A1A1A"/>
+          <w:sz w:val="19"/>
+          <w:szCs w:val="19"/>
+        </w:rPr>
+        <w:t xml:space="preserve">Baustellensicherung, Verkehrslenkung und Kundenansprache</w:t>
       </w:r>
     </w:p>
     <w:p>
@@ -381,7 +335,7 @@
           <w:sz w:val="18"/>
           <w:szCs w:val="18"/>
         </w:rPr>
-        <w:t xml:space="preserve">03/2026 – heute</w:t>
+        <w:t xml:space="preserve">2015 – 2017</w:t>
       </w:r>
       <w:r>
         <w:rPr>
@@ -401,7 +355,7 @@
           <w:sz w:val="20"/>
           <w:szCs w:val="20"/>
         </w:rPr>
-        <w:t xml:space="preserve">Selbstständiger Energieberater &amp; Texter</w:t>
+        <w:t xml:space="preserve">Sachbearbeiter Auftragsmanagement</w:t>
       </w:r>
     </w:p>
     <w:p>
@@ -418,76 +372,53 @@
           <w:sz w:val="18"/>
           <w:szCs w:val="18"/>
         </w:rPr>
-        <w:t xml:space="preserve">Frankfurt Energie / TELESON AG · frankfurt-energie.online</w:t>
-      </w:r>
-    </w:p>
-    <w:p>
-      <w:pPr>
-        <w:spacing w:after="36"/>
-      </w:pPr>
-      <w:r>
-        <w:rPr>
-          <w:rFonts w:ascii="Arial" w:cs="Arial" w:eastAsia="Arial" w:hAnsi="Arial"/>
-          <w:color w:val="666666"/>
-          <w:sz w:val="20"/>
-          <w:szCs w:val="20"/>
-        </w:rPr>
-        <w:t xml:space="preserve">· </w:t>
-      </w:r>
-      <w:r>
-        <w:rPr>
-          <w:rFonts w:ascii="Arial" w:cs="Arial" w:eastAsia="Arial" w:hAnsi="Arial"/>
-          <w:color w:val="1A1A1A"/>
-          <w:sz w:val="19"/>
-          <w:szCs w:val="19"/>
-        </w:rPr>
-        <w:t xml:space="preserve">Direktvertrieb von Strom- und Gastarifen als TELESON-Partner</w:t>
-      </w:r>
-    </w:p>
-    <w:p>
-      <w:pPr>
-        <w:spacing w:after="36"/>
-      </w:pPr>
-      <w:r>
-        <w:rPr>
-          <w:rFonts w:ascii="Arial" w:cs="Arial" w:eastAsia="Arial" w:hAnsi="Arial"/>
-          <w:color w:val="666666"/>
-          <w:sz w:val="20"/>
-          <w:szCs w:val="20"/>
-        </w:rPr>
-        <w:t xml:space="preserve">· </w:t>
-      </w:r>
-      <w:r>
-        <w:rPr>
-          <w:rFonts w:ascii="Arial" w:cs="Arial" w:eastAsia="Arial" w:hAnsi="Arial"/>
-          <w:color w:val="1A1A1A"/>
-          <w:sz w:val="19"/>
-          <w:szCs w:val="19"/>
-        </w:rPr>
-        <w:t xml:space="preserve">Aufbau und Pflege der Website auf GitHub Pages</w:t>
-      </w:r>
-    </w:p>
-    <w:p>
-      <w:pPr>
-        <w:spacing w:after="36"/>
-      </w:pPr>
-      <w:r>
-        <w:rPr>
-          <w:rFonts w:ascii="Arial" w:cs="Arial" w:eastAsia="Arial" w:hAnsi="Arial"/>
-          <w:color w:val="666666"/>
-          <w:sz w:val="20"/>
-          <w:szCs w:val="20"/>
-        </w:rPr>
-        <w:t xml:space="preserve">· </w:t>
-      </w:r>
-      <w:r>
-        <w:rPr>
-          <w:rFonts w:ascii="Arial" w:cs="Arial" w:eastAsia="Arial" w:hAnsi="Arial"/>
-          <w:color w:val="1A1A1A"/>
-          <w:sz w:val="19"/>
-          <w:szCs w:val="19"/>
-        </w:rPr>
-        <w:t xml:space="preserve">Erstellung von SEO-Texten, Tarifvergleichen und Angebotsinhalten</w:t>
+        <w:t xml:space="preserve">GWR GmbH, Frankfurt am Main</w:t>
+      </w:r>
+    </w:p>
+    <w:p>
+      <w:pPr>
+        <w:spacing w:after="36"/>
+      </w:pPr>
+      <w:r>
+        <w:rPr>
+          <w:rFonts w:ascii="Arial" w:cs="Arial" w:eastAsia="Arial" w:hAnsi="Arial"/>
+          <w:color w:val="666666"/>
+          <w:sz w:val="20"/>
+          <w:szCs w:val="20"/>
+        </w:rPr>
+        <w:t xml:space="preserve">· </w:t>
+      </w:r>
+      <w:r>
+        <w:rPr>
+          <w:rFonts w:ascii="Arial" w:cs="Arial" w:eastAsia="Arial" w:hAnsi="Arial"/>
+          <w:color w:val="1A1A1A"/>
+          <w:sz w:val="19"/>
+          <w:szCs w:val="19"/>
+        </w:rPr>
+        <w:t xml:space="preserve">Kundenkontakt, Angebotserstellung und Reklamationsbearbeitung</w:t>
+      </w:r>
+    </w:p>
+    <w:p>
+      <w:pPr>
+        <w:spacing w:after="36"/>
+      </w:pPr>
+      <w:r>
+        <w:rPr>
+          <w:rFonts w:ascii="Arial" w:cs="Arial" w:eastAsia="Arial" w:hAnsi="Arial"/>
+          <w:color w:val="666666"/>
+          <w:sz w:val="20"/>
+          <w:szCs w:val="20"/>
+        </w:rPr>
+        <w:t xml:space="preserve">· </w:t>
+      </w:r>
+      <w:r>
+        <w:rPr>
+          <w:rFonts w:ascii="Arial" w:cs="Arial" w:eastAsia="Arial" w:hAnsi="Arial"/>
+          <w:color w:val="1A1A1A"/>
+          <w:sz w:val="19"/>
+          <w:szCs w:val="19"/>
+        </w:rPr>
+        <w:t xml:space="preserve">Außendienst und Angebotskommunikation</w:t>
       </w:r>
     </w:p>
     <w:p>
@@ -502,7 +433,7 @@
           <w:sz w:val="18"/>
           <w:szCs w:val="18"/>
         </w:rPr>
-        <w:t xml:space="preserve">2025 – heute</w:t>
+        <w:t xml:space="preserve">2014 – 2015</w:t>
       </w:r>
       <w:r>
         <w:rPr>
@@ -522,7 +453,7 @@
           <w:sz w:val="20"/>
           <w:szCs w:val="20"/>
         </w:rPr>
-        <w:t xml:space="preserve">Ghostwriter &amp; Autor für Behördenkommunikation</w:t>
+        <w:t xml:space="preserve">MPU-Berater &amp; Erste-Hilfe-Ausbilder</w:t>
       </w:r>
     </w:p>
     <w:p>
@@ -539,76 +470,76 @@
           <w:sz w:val="18"/>
           <w:szCs w:val="18"/>
         </w:rPr>
-        <w:t xml:space="preserve">Freiberuflich, Frankfurt am Main</w:t>
-      </w:r>
-    </w:p>
-    <w:p>
-      <w:pPr>
-        <w:spacing w:after="36"/>
-      </w:pPr>
-      <w:r>
-        <w:rPr>
-          <w:rFonts w:ascii="Arial" w:cs="Arial" w:eastAsia="Arial" w:hAnsi="Arial"/>
-          <w:color w:val="666666"/>
-          <w:sz w:val="20"/>
-          <w:szCs w:val="20"/>
-        </w:rPr>
-        <w:t xml:space="preserve">· </w:t>
-      </w:r>
-      <w:r>
-        <w:rPr>
-          <w:rFonts w:ascii="Arial" w:cs="Arial" w:eastAsia="Arial" w:hAnsi="Arial"/>
-          <w:color w:val="1A1A1A"/>
-          <w:sz w:val="19"/>
-          <w:szCs w:val="19"/>
-        </w:rPr>
-        <w:t xml:space="preserve">Ghostwriting für Privatpersonen und Unternehmen</w:t>
-      </w:r>
-    </w:p>
-    <w:p>
-      <w:pPr>
-        <w:spacing w:after="36"/>
-      </w:pPr>
-      <w:r>
-        <w:rPr>
-          <w:rFonts w:ascii="Arial" w:cs="Arial" w:eastAsia="Arial" w:hAnsi="Arial"/>
-          <w:color w:val="666666"/>
-          <w:sz w:val="20"/>
-          <w:szCs w:val="20"/>
-        </w:rPr>
-        <w:t xml:space="preserve">· </w:t>
-      </w:r>
-      <w:r>
-        <w:rPr>
-          <w:rFonts w:ascii="Arial" w:cs="Arial" w:eastAsia="Arial" w:hAnsi="Arial"/>
-          <w:color w:val="1A1A1A"/>
-          <w:sz w:val="19"/>
-          <w:szCs w:val="19"/>
-        </w:rPr>
-        <w:t xml:space="preserve">Juristische und behördliche Korrespondenz, Widersprüche, Anwaltsschreiben</w:t>
-      </w:r>
-    </w:p>
-    <w:p>
-      <w:pPr>
-        <w:spacing w:after="36"/>
-      </w:pPr>
-      <w:r>
-        <w:rPr>
-          <w:rFonts w:ascii="Arial" w:cs="Arial" w:eastAsia="Arial" w:hAnsi="Arial"/>
-          <w:color w:val="666666"/>
-          <w:sz w:val="20"/>
-          <w:szCs w:val="20"/>
-        </w:rPr>
-        <w:t xml:space="preserve">· </w:t>
-      </w:r>
-      <w:r>
-        <w:rPr>
-          <w:rFonts w:ascii="Arial" w:cs="Arial" w:eastAsia="Arial" w:hAnsi="Arial"/>
-          <w:color w:val="1A1A1A"/>
-          <w:sz w:val="19"/>
-          <w:szCs w:val="19"/>
-        </w:rPr>
-        <w:t xml:space="preserve">Texte im Ericksonian-Stil für Hypnose und Coaching</w:t>
+        <w:t xml:space="preserve">UPGRADE.EU GmbH, Frankfurt am Main</w:t>
+      </w:r>
+    </w:p>
+    <w:p>
+      <w:pPr>
+        <w:spacing w:after="36"/>
+      </w:pPr>
+      <w:r>
+        <w:rPr>
+          <w:rFonts w:ascii="Arial" w:cs="Arial" w:eastAsia="Arial" w:hAnsi="Arial"/>
+          <w:color w:val="666666"/>
+          <w:sz w:val="20"/>
+          <w:szCs w:val="20"/>
+        </w:rPr>
+        <w:t xml:space="preserve">· </w:t>
+      </w:r>
+      <w:r>
+        <w:rPr>
+          <w:rFonts w:ascii="Arial" w:cs="Arial" w:eastAsia="Arial" w:hAnsi="Arial"/>
+          <w:color w:val="1A1A1A"/>
+          <w:sz w:val="19"/>
+          <w:szCs w:val="19"/>
+        </w:rPr>
+        <w:t xml:space="preserve">Entwicklung individueller Vorbereitungskonzepte aus Verkehrsakten</w:t>
+      </w:r>
+    </w:p>
+    <w:p>
+      <w:pPr>
+        <w:spacing w:after="36"/>
+      </w:pPr>
+      <w:r>
+        <w:rPr>
+          <w:rFonts w:ascii="Arial" w:cs="Arial" w:eastAsia="Arial" w:hAnsi="Arial"/>
+          <w:color w:val="666666"/>
+          <w:sz w:val="20"/>
+          <w:szCs w:val="20"/>
+        </w:rPr>
+        <w:t xml:space="preserve">· </w:t>
+      </w:r>
+      <w:r>
+        <w:rPr>
+          <w:rFonts w:ascii="Arial" w:cs="Arial" w:eastAsia="Arial" w:hAnsi="Arial"/>
+          <w:color w:val="1A1A1A"/>
+          <w:sz w:val="19"/>
+          <w:szCs w:val="19"/>
+        </w:rPr>
+        <w:t xml:space="preserve">Begleitung von Kandidaten im MPU-Prozess</w:t>
+      </w:r>
+    </w:p>
+    <w:p>
+      <w:pPr>
+        <w:spacing w:after="36"/>
+      </w:pPr>
+      <w:r>
+        <w:rPr>
+          <w:rFonts w:ascii="Arial" w:cs="Arial" w:eastAsia="Arial" w:hAnsi="Arial"/>
+          <w:color w:val="666666"/>
+          <w:sz w:val="20"/>
+          <w:szCs w:val="20"/>
+        </w:rPr>
+        <w:t xml:space="preserve">· </w:t>
+      </w:r>
+      <w:r>
+        <w:rPr>
+          <w:rFonts w:ascii="Arial" w:cs="Arial" w:eastAsia="Arial" w:hAnsi="Arial"/>
+          <w:color w:val="1A1A1A"/>
+          <w:sz w:val="19"/>
+          <w:szCs w:val="19"/>
+        </w:rPr>
+        <w:t xml:space="preserve">Durchführung von Erste-Hilfe-Ausbildungen für Fahranfänger</w:t>
       </w:r>
     </w:p>
     <w:p>
@@ -623,7 +554,7 @@
           <w:sz w:val="18"/>
           <w:szCs w:val="18"/>
         </w:rPr>
-        <w:t xml:space="preserve">2025 – 2026</w:t>
+        <w:t xml:space="preserve">2009 – 2013</w:t>
       </w:r>
       <w:r>
         <w:rPr>
@@ -643,7 +574,7 @@
           <w:sz w:val="20"/>
           <w:szCs w:val="20"/>
         </w:rPr>
-        <w:t xml:space="preserve">Entwickler — CROWN v10 Value-Bet-System</w:t>
+        <w:t xml:space="preserve">Callcenter-Agent &amp; Fahrschülerbetreuung</w:t>
       </w:r>
     </w:p>
     <w:p>
@@ -660,76 +591,99 @@
           <w:sz w:val="18"/>
           <w:szCs w:val="18"/>
         </w:rPr>
-        <w:t xml:space="preserve">Eigenentwicklung (Termux / Android)</w:t>
-      </w:r>
-    </w:p>
-    <w:p>
-      <w:pPr>
-        <w:spacing w:after="36"/>
-      </w:pPr>
-      <w:r>
-        <w:rPr>
-          <w:rFonts w:ascii="Arial" w:cs="Arial" w:eastAsia="Arial" w:hAnsi="Arial"/>
-          <w:color w:val="666666"/>
-          <w:sz w:val="20"/>
-          <w:szCs w:val="20"/>
-        </w:rPr>
-        <w:t xml:space="preserve">· </w:t>
-      </w:r>
-      <w:r>
-        <w:rPr>
-          <w:rFonts w:ascii="Arial" w:cs="Arial" w:eastAsia="Arial" w:hAnsi="Arial"/>
-          <w:color w:val="1A1A1A"/>
-          <w:sz w:val="19"/>
-          <w:szCs w:val="19"/>
-        </w:rPr>
-        <w:t xml:space="preserve">Entwicklung eines datengetriebenen Analyse- und Entscheidungssystems</w:t>
-      </w:r>
-    </w:p>
-    <w:p>
-      <w:pPr>
-        <w:spacing w:after="36"/>
-      </w:pPr>
-      <w:r>
-        <w:rPr>
-          <w:rFonts w:ascii="Arial" w:cs="Arial" w:eastAsia="Arial" w:hAnsi="Arial"/>
-          <w:color w:val="666666"/>
-          <w:sz w:val="20"/>
-          <w:szCs w:val="20"/>
-        </w:rPr>
-        <w:t xml:space="preserve">· </w:t>
-      </w:r>
-      <w:r>
-        <w:rPr>
-          <w:rFonts w:ascii="Arial" w:cs="Arial" w:eastAsia="Arial" w:hAnsi="Arial"/>
-          <w:color w:val="1A1A1A"/>
-          <w:sz w:val="19"/>
-          <w:szCs w:val="19"/>
-        </w:rPr>
-        <w:t xml:space="preserve">Umsetzung mit Telegram-Bot, SQLite-Datenbank und Multi-Threading</w:t>
-      </w:r>
-    </w:p>
-    <w:p>
-      <w:pPr>
-        <w:spacing w:after="36"/>
-      </w:pPr>
-      <w:r>
-        <w:rPr>
-          <w:rFonts w:ascii="Arial" w:cs="Arial" w:eastAsia="Arial" w:hAnsi="Arial"/>
-          <w:color w:val="666666"/>
-          <w:sz w:val="20"/>
-          <w:szCs w:val="20"/>
-        </w:rPr>
-        <w:t xml:space="preserve">· </w:t>
-      </w:r>
-      <w:r>
-        <w:rPr>
-          <w:rFonts w:ascii="Arial" w:cs="Arial" w:eastAsia="Arial" w:hAnsi="Arial"/>
-          <w:color w:val="1A1A1A"/>
-          <w:sz w:val="19"/>
-          <w:szCs w:val="19"/>
-        </w:rPr>
-        <w:t xml:space="preserve">Kelly-Criterion-Sizing und automatische GitHub-Backups</w:t>
+        <w:t xml:space="preserve">Scout-Logic — Internationale Fahrschulen</w:t>
+      </w:r>
+    </w:p>
+    <w:p>
+      <w:pPr>
+        <w:spacing w:after="36"/>
+      </w:pPr>
+      <w:r>
+        <w:rPr>
+          <w:rFonts w:ascii="Arial" w:cs="Arial" w:eastAsia="Arial" w:hAnsi="Arial"/>
+          <w:color w:val="666666"/>
+          <w:sz w:val="20"/>
+          <w:szCs w:val="20"/>
+        </w:rPr>
+        <w:t xml:space="preserve">· </w:t>
+      </w:r>
+      <w:r>
+        <w:rPr>
+          <w:rFonts w:ascii="Arial" w:cs="Arial" w:eastAsia="Arial" w:hAnsi="Arial"/>
+          <w:color w:val="1A1A1A"/>
+          <w:sz w:val="19"/>
+          <w:szCs w:val="19"/>
+        </w:rPr>
+        <w:t xml:space="preserve">Beratung und Betreuung internationaler Fahrschüler im Callcenter</w:t>
+      </w:r>
+    </w:p>
+    <w:p>
+      <w:pPr>
+        <w:spacing w:after="36"/>
+      </w:pPr>
+      <w:r>
+        <w:rPr>
+          <w:rFonts w:ascii="Arial" w:cs="Arial" w:eastAsia="Arial" w:hAnsi="Arial"/>
+          <w:color w:val="666666"/>
+          <w:sz w:val="20"/>
+          <w:szCs w:val="20"/>
+        </w:rPr>
+        <w:t xml:space="preserve">· </w:t>
+      </w:r>
+      <w:r>
+        <w:rPr>
+          <w:rFonts w:ascii="Arial" w:cs="Arial" w:eastAsia="Arial" w:hAnsi="Arial"/>
+          <w:color w:val="1A1A1A"/>
+          <w:sz w:val="19"/>
+          <w:szCs w:val="19"/>
+        </w:rPr>
+        <w:t xml:space="preserve">Entwicklung und Aufbau der Moodle-Lernplattform für deutsche Kunden in Tschechien</w:t>
+      </w:r>
+    </w:p>
+    <w:p>
+      <w:pPr>
+        <w:spacing w:after="36"/>
+      </w:pPr>
+      <w:r>
+        <w:rPr>
+          <w:rFonts w:ascii="Arial" w:cs="Arial" w:eastAsia="Arial" w:hAnsi="Arial"/>
+          <w:color w:val="666666"/>
+          <w:sz w:val="20"/>
+          <w:szCs w:val="20"/>
+        </w:rPr>
+        <w:t xml:space="preserve">· </w:t>
+      </w:r>
+      <w:r>
+        <w:rPr>
+          <w:rFonts w:ascii="Arial" w:cs="Arial" w:eastAsia="Arial" w:hAnsi="Arial"/>
+          <w:color w:val="1A1A1A"/>
+          <w:sz w:val="19"/>
+          <w:szCs w:val="19"/>
+        </w:rPr>
+        <w:t xml:space="preserve">Tschechisches Fahrschul-Lehrbuch analysiert und in klares Deutsch überführt</w:t>
+      </w:r>
+    </w:p>
+    <w:p>
+      <w:pPr>
+        <w:spacing w:after="36"/>
+      </w:pPr>
+      <w:r>
+        <w:rPr>
+          <w:rFonts w:ascii="Arial" w:cs="Arial" w:eastAsia="Arial" w:hAnsi="Arial"/>
+          <w:color w:val="666666"/>
+          <w:sz w:val="20"/>
+          <w:szCs w:val="20"/>
+        </w:rPr>
+        <w:t xml:space="preserve">· </w:t>
+      </w:r>
+      <w:r>
+        <w:rPr>
+          <w:rFonts w:ascii="Arial" w:cs="Arial" w:eastAsia="Arial" w:hAnsi="Arial"/>
+          <w:color w:val="1A1A1A"/>
+          <w:sz w:val="19"/>
+          <w:szCs w:val="19"/>
+        </w:rPr>
+        <w:t xml:space="preserve">Lernplattform mit simulierten Prüfungen und Antwortlogik aufgebaut</w:t>
       </w:r>
     </w:p>
     <w:p>
@@ -744,7 +698,7 @@
           <w:sz w:val="18"/>
           <w:szCs w:val="18"/>
         </w:rPr>
-        <w:t xml:space="preserve">2016 – heute</w:t>
+        <w:t xml:space="preserve">2001 – 2009</w:t>
       </w:r>
       <w:r>
         <w:rPr>
@@ -764,7 +718,7 @@
           <w:sz w:val="20"/>
           <w:szCs w:val="20"/>
         </w:rPr>
-        <w:t xml:space="preserve">Politischer Texter &amp; Ghostwriter</w:t>
+        <w:t xml:space="preserve">Produktionsmitarbeiter / Versand</w:t>
       </w:r>
     </w:p>
     <w:p>
@@ -781,76 +735,53 @@
           <w:sz w:val="18"/>
           <w:szCs w:val="18"/>
         </w:rPr>
-        <w:t xml:space="preserve">BFF Bürger für Frankfurt e. V. / Freie Wähler Frankfurt</w:t>
-      </w:r>
-    </w:p>
-    <w:p>
-      <w:pPr>
-        <w:spacing w:after="36"/>
-      </w:pPr>
-      <w:r>
-        <w:rPr>
-          <w:rFonts w:ascii="Arial" w:cs="Arial" w:eastAsia="Arial" w:hAnsi="Arial"/>
-          <w:color w:val="666666"/>
-          <w:sz w:val="20"/>
-          <w:szCs w:val="20"/>
-        </w:rPr>
-        <w:t xml:space="preserve">· </w:t>
-      </w:r>
-      <w:r>
-        <w:rPr>
-          <w:rFonts w:ascii="Arial" w:cs="Arial" w:eastAsia="Arial" w:hAnsi="Arial"/>
-          <w:color w:val="1A1A1A"/>
-          <w:sz w:val="19"/>
-          <w:szCs w:val="19"/>
-        </w:rPr>
-        <w:t xml:space="preserve">Erstellung offizieller Anträge für den Ortsbeirat 10</w:t>
-      </w:r>
-    </w:p>
-    <w:p>
-      <w:pPr>
-        <w:spacing w:after="36"/>
-      </w:pPr>
-      <w:r>
-        <w:rPr>
-          <w:rFonts w:ascii="Arial" w:cs="Arial" w:eastAsia="Arial" w:hAnsi="Arial"/>
-          <w:color w:val="666666"/>
-          <w:sz w:val="20"/>
-          <w:szCs w:val="20"/>
-        </w:rPr>
-        <w:t xml:space="preserve">· </w:t>
-      </w:r>
-      <w:r>
-        <w:rPr>
-          <w:rFonts w:ascii="Arial" w:cs="Arial" w:eastAsia="Arial" w:hAnsi="Arial"/>
-          <w:color w:val="1A1A1A"/>
-          <w:sz w:val="19"/>
-          <w:szCs w:val="19"/>
-        </w:rPr>
-        <w:t xml:space="preserve">Wahlprogramm der Freien Wähler Frankfurt 2026 vollständig neu geschrieben</w:t>
-      </w:r>
-    </w:p>
-    <w:p>
-      <w:pPr>
-        <w:spacing w:after="36"/>
-      </w:pPr>
-      <w:r>
-        <w:rPr>
-          <w:rFonts w:ascii="Arial" w:cs="Arial" w:eastAsia="Arial" w:hAnsi="Arial"/>
-          <w:color w:val="666666"/>
-          <w:sz w:val="20"/>
-          <w:szCs w:val="20"/>
-        </w:rPr>
-        <w:t xml:space="preserve">· </w:t>
-      </w:r>
-      <w:r>
-        <w:rPr>
-          <w:rFonts w:ascii="Arial" w:cs="Arial" w:eastAsia="Arial" w:hAnsi="Arial"/>
-          <w:color w:val="1A1A1A"/>
-          <w:sz w:val="19"/>
-          <w:szCs w:val="19"/>
-        </w:rPr>
-        <w:t xml:space="preserve">Listenkandidat Platz 4 (Stadtverordnetenversammlung) / Platz 2 (Ortsbeirat)</w:t>
+        <w:t xml:space="preserve">Valeo Kronach</w:t>
+      </w:r>
+    </w:p>
+    <w:p>
+      <w:pPr>
+        <w:spacing w:after="36"/>
+      </w:pPr>
+      <w:r>
+        <w:rPr>
+          <w:rFonts w:ascii="Arial" w:cs="Arial" w:eastAsia="Arial" w:hAnsi="Arial"/>
+          <w:color w:val="666666"/>
+          <w:sz w:val="20"/>
+          <w:szCs w:val="20"/>
+        </w:rPr>
+        <w:t xml:space="preserve">· </w:t>
+      </w:r>
+      <w:r>
+        <w:rPr>
+          <w:rFonts w:ascii="Arial" w:cs="Arial" w:eastAsia="Arial" w:hAnsi="Arial"/>
+          <w:color w:val="1A1A1A"/>
+          <w:sz w:val="19"/>
+          <w:szCs w:val="19"/>
+        </w:rPr>
+        <w:t xml:space="preserve">Fertigung und Versandlogistik in der Automobilzulieferindustrie</w:t>
+      </w:r>
+    </w:p>
+    <w:p>
+      <w:pPr>
+        <w:spacing w:after="36"/>
+      </w:pPr>
+      <w:r>
+        <w:rPr>
+          <w:rFonts w:ascii="Arial" w:cs="Arial" w:eastAsia="Arial" w:hAnsi="Arial"/>
+          <w:color w:val="666666"/>
+          <w:sz w:val="20"/>
+          <w:szCs w:val="20"/>
+        </w:rPr>
+        <w:t xml:space="preserve">· </w:t>
+      </w:r>
+      <w:r>
+        <w:rPr>
+          <w:rFonts w:ascii="Arial" w:cs="Arial" w:eastAsia="Arial" w:hAnsi="Arial"/>
+          <w:color w:val="1A1A1A"/>
+          <w:sz w:val="19"/>
+          <w:szCs w:val="19"/>
+        </w:rPr>
+        <w:t xml:space="preserve">Qualitätssicherung und Prozessabläufe in der Produktion</w:t>
       </w:r>
     </w:p>
     <w:p>
@@ -865,7 +796,7 @@
           <w:sz w:val="18"/>
           <w:szCs w:val="18"/>
         </w:rPr>
-        <w:t xml:space="preserve">2015 – 2017</w:t>
+        <w:t xml:space="preserve">1998 – 2001</w:t>
       </w:r>
       <w:r>
         <w:rPr>
@@ -885,7 +816,7 @@
           <w:sz w:val="20"/>
           <w:szCs w:val="20"/>
         </w:rPr>
-        <w:t xml:space="preserve">Sachbearbeiter Auftragsmanagement</w:t>
+        <w:t xml:space="preserve">Selbstständiger Vermögensberater (nebenberuflich)</w:t>
       </w:r>
     </w:p>
     <w:p>
@@ -902,53 +833,53 @@
           <w:sz w:val="18"/>
           <w:szCs w:val="18"/>
         </w:rPr>
-        <w:t xml:space="preserve">GWR GmbH, Frankfurt am Main</w:t>
-      </w:r>
-    </w:p>
-    <w:p>
-      <w:pPr>
-        <w:spacing w:after="36"/>
-      </w:pPr>
-      <w:r>
-        <w:rPr>
-          <w:rFonts w:ascii="Arial" w:cs="Arial" w:eastAsia="Arial" w:hAnsi="Arial"/>
-          <w:color w:val="666666"/>
-          <w:sz w:val="20"/>
-          <w:szCs w:val="20"/>
-        </w:rPr>
-        <w:t xml:space="preserve">· </w:t>
-      </w:r>
-      <w:r>
-        <w:rPr>
-          <w:rFonts w:ascii="Arial" w:cs="Arial" w:eastAsia="Arial" w:hAnsi="Arial"/>
-          <w:color w:val="1A1A1A"/>
-          <w:sz w:val="19"/>
-          <w:szCs w:val="19"/>
-        </w:rPr>
-        <w:t xml:space="preserve">Kundenkontakt, Angebotserstellung und Reklamationsbearbeitung</w:t>
-      </w:r>
-    </w:p>
-    <w:p>
-      <w:pPr>
-        <w:spacing w:after="36"/>
-      </w:pPr>
-      <w:r>
-        <w:rPr>
-          <w:rFonts w:ascii="Arial" w:cs="Arial" w:eastAsia="Arial" w:hAnsi="Arial"/>
-          <w:color w:val="666666"/>
-          <w:sz w:val="20"/>
-          <w:szCs w:val="20"/>
-        </w:rPr>
-        <w:t xml:space="preserve">· </w:t>
-      </w:r>
-      <w:r>
-        <w:rPr>
-          <w:rFonts w:ascii="Arial" w:cs="Arial" w:eastAsia="Arial" w:hAnsi="Arial"/>
-          <w:color w:val="1A1A1A"/>
-          <w:sz w:val="19"/>
-          <w:szCs w:val="19"/>
-        </w:rPr>
-        <w:t xml:space="preserve">Außendienst und Angebotskommunikation</w:t>
+        <w:t xml:space="preserve">Deutsche Vermögensberatung AG (DVAG)</w:t>
+      </w:r>
+    </w:p>
+    <w:p>
+      <w:pPr>
+        <w:spacing w:after="36"/>
+      </w:pPr>
+      <w:r>
+        <w:rPr>
+          <w:rFonts w:ascii="Arial" w:cs="Arial" w:eastAsia="Arial" w:hAnsi="Arial"/>
+          <w:color w:val="666666"/>
+          <w:sz w:val="20"/>
+          <w:szCs w:val="20"/>
+        </w:rPr>
+        <w:t xml:space="preserve">· </w:t>
+      </w:r>
+      <w:r>
+        <w:rPr>
+          <w:rFonts w:ascii="Arial" w:cs="Arial" w:eastAsia="Arial" w:hAnsi="Arial"/>
+          <w:color w:val="1A1A1A"/>
+          <w:sz w:val="19"/>
+          <w:szCs w:val="19"/>
+        </w:rPr>
+        <w:t xml:space="preserve">Beratung von Privatkunden zu Versicherungs- und Finanzprodukten</w:t>
+      </w:r>
+    </w:p>
+    <w:p>
+      <w:pPr>
+        <w:spacing w:after="36"/>
+      </w:pPr>
+      <w:r>
+        <w:rPr>
+          <w:rFonts w:ascii="Arial" w:cs="Arial" w:eastAsia="Arial" w:hAnsi="Arial"/>
+          <w:color w:val="666666"/>
+          <w:sz w:val="20"/>
+          <w:szCs w:val="20"/>
+        </w:rPr>
+        <w:t xml:space="preserve">· </w:t>
+      </w:r>
+      <w:r>
+        <w:rPr>
+          <w:rFonts w:ascii="Arial" w:cs="Arial" w:eastAsia="Arial" w:hAnsi="Arial"/>
+          <w:color w:val="1A1A1A"/>
+          <w:sz w:val="19"/>
+          <w:szCs w:val="19"/>
+        </w:rPr>
+        <w:t xml:space="preserve">Eigenständige Kundengewinnung und Beziehungspflege</w:t>
       </w:r>
     </w:p>
     <w:p>
@@ -963,7 +894,7 @@
           <w:sz w:val="18"/>
           <w:szCs w:val="18"/>
         </w:rPr>
-        <w:t xml:space="preserve">2019</w:t>
+        <w:t xml:space="preserve">1998 – 2000</w:t>
       </w:r>
       <w:r>
         <w:rPr>
@@ -983,7 +914,7 @@
           <w:sz w:val="20"/>
           <w:szCs w:val="20"/>
         </w:rPr>
-        <w:t xml:space="preserve">Sicherheitsmitarbeiter</w:t>
+        <w:t xml:space="preserve">Englisch-Nachhilfelehrer (nebenberuflich)</w:t>
       </w:r>
     </w:p>
     <w:p>
@@ -1000,30 +931,53 @@
           <w:sz w:val="18"/>
           <w:szCs w:val="18"/>
         </w:rPr>
-        <w:t xml:space="preserve">LAWS Dienstleistungs- und Servicemanagement, Florstadt</w:t>
-      </w:r>
-    </w:p>
-    <w:p>
-      <w:pPr>
-        <w:spacing w:after="36"/>
-      </w:pPr>
-      <w:r>
-        <w:rPr>
-          <w:rFonts w:ascii="Arial" w:cs="Arial" w:eastAsia="Arial" w:hAnsi="Arial"/>
-          <w:color w:val="666666"/>
-          <w:sz w:val="20"/>
-          <w:szCs w:val="20"/>
-        </w:rPr>
-        <w:t xml:space="preserve">· </w:t>
-      </w:r>
-      <w:r>
-        <w:rPr>
-          <w:rFonts w:ascii="Arial" w:cs="Arial" w:eastAsia="Arial" w:hAnsi="Arial"/>
-          <w:color w:val="1A1A1A"/>
-          <w:sz w:val="19"/>
-          <w:szCs w:val="19"/>
-        </w:rPr>
-        <w:t xml:space="preserve">Baustellensicherung, Verkehrslenkung und Kundenansprache</w:t>
+        <w:t xml:space="preserve">Schülerhilfe Kronach</w:t>
+      </w:r>
+    </w:p>
+    <w:p>
+      <w:pPr>
+        <w:spacing w:after="36"/>
+      </w:pPr>
+      <w:r>
+        <w:rPr>
+          <w:rFonts w:ascii="Arial" w:cs="Arial" w:eastAsia="Arial" w:hAnsi="Arial"/>
+          <w:color w:val="666666"/>
+          <w:sz w:val="20"/>
+          <w:szCs w:val="20"/>
+        </w:rPr>
+        <w:t xml:space="preserve">· </w:t>
+      </w:r>
+      <w:r>
+        <w:rPr>
+          <w:rFonts w:ascii="Arial" w:cs="Arial" w:eastAsia="Arial" w:hAnsi="Arial"/>
+          <w:color w:val="1A1A1A"/>
+          <w:sz w:val="19"/>
+          <w:szCs w:val="19"/>
+        </w:rPr>
+        <w:t xml:space="preserve">Individuelle Lehrmaterialien für gemischte Gruppen (Kl. 3 – Abitur)</w:t>
+      </w:r>
+    </w:p>
+    <w:p>
+      <w:pPr>
+        <w:spacing w:after="36"/>
+      </w:pPr>
+      <w:r>
+        <w:rPr>
+          <w:rFonts w:ascii="Arial" w:cs="Arial" w:eastAsia="Arial" w:hAnsi="Arial"/>
+          <w:color w:val="666666"/>
+          <w:sz w:val="20"/>
+          <w:szCs w:val="20"/>
+        </w:rPr>
+        <w:t xml:space="preserve">· </w:t>
+      </w:r>
+      <w:r>
+        <w:rPr>
+          <w:rFonts w:ascii="Arial" w:cs="Arial" w:eastAsia="Arial" w:hAnsi="Arial"/>
+          <w:color w:val="1A1A1A"/>
+          <w:sz w:val="19"/>
+          <w:szCs w:val="19"/>
+        </w:rPr>
+        <w:t xml:space="preserve">Altersgerechte Handouts und Übungsblätter eigenständig entwickelt</w:t>
       </w:r>
     </w:p>
     <w:p>
@@ -1038,7 +992,7 @@
           <w:sz w:val="18"/>
           <w:szCs w:val="18"/>
         </w:rPr>
-        <w:t xml:space="preserve">2009 – 2012</w:t>
+        <w:t xml:space="preserve">1997 – 1998</w:t>
       </w:r>
       <w:r>
         <w:rPr>
@@ -1058,7 +1012,7 @@
           <w:sz w:val="20"/>
           <w:szCs w:val="20"/>
         </w:rPr>
-        <w:t xml:space="preserve">Aufbau Moodle-Lernplattform</w:t>
+        <w:t xml:space="preserve">Grundwehrdienst · Sanitätsdienst</w:t>
       </w:r>
     </w:p>
     <w:p>
@@ -1075,76 +1029,30 @@
           <w:sz w:val="18"/>
           <w:szCs w:val="18"/>
         </w:rPr>
-        <w:t xml:space="preserve">Führerscheinvorbereitung für deutsche Kunden in Tschechien</w:t>
-      </w:r>
-    </w:p>
-    <w:p>
-      <w:pPr>
-        <w:spacing w:after="36"/>
-      </w:pPr>
-      <w:r>
-        <w:rPr>
-          <w:rFonts w:ascii="Arial" w:cs="Arial" w:eastAsia="Arial" w:hAnsi="Arial"/>
-          <w:color w:val="666666"/>
-          <w:sz w:val="20"/>
-          <w:szCs w:val="20"/>
-        </w:rPr>
-        <w:t xml:space="preserve">· </w:t>
-      </w:r>
-      <w:r>
-        <w:rPr>
-          <w:rFonts w:ascii="Arial" w:cs="Arial" w:eastAsia="Arial" w:hAnsi="Arial"/>
-          <w:color w:val="1A1A1A"/>
-          <w:sz w:val="19"/>
-          <w:szCs w:val="19"/>
-        </w:rPr>
-        <w:t xml:space="preserve">Tschechisches Fahrschul-Lehrbuch analysiert und in klares Deutsch überführt</w:t>
-      </w:r>
-    </w:p>
-    <w:p>
-      <w:pPr>
-        <w:spacing w:after="36"/>
-      </w:pPr>
-      <w:r>
-        <w:rPr>
-          <w:rFonts w:ascii="Arial" w:cs="Arial" w:eastAsia="Arial" w:hAnsi="Arial"/>
-          <w:color w:val="666666"/>
-          <w:sz w:val="20"/>
-          <w:szCs w:val="20"/>
-        </w:rPr>
-        <w:t xml:space="preserve">· </w:t>
-      </w:r>
-      <w:r>
-        <w:rPr>
-          <w:rFonts w:ascii="Arial" w:cs="Arial" w:eastAsia="Arial" w:hAnsi="Arial"/>
-          <w:color w:val="1A1A1A"/>
-          <w:sz w:val="19"/>
-          <w:szCs w:val="19"/>
-        </w:rPr>
-        <w:t xml:space="preserve">Lernplattform mit simulierten Prüfungen und Antwortlogik aufgebaut</w:t>
-      </w:r>
-    </w:p>
-    <w:p>
-      <w:pPr>
-        <w:spacing w:after="36"/>
-      </w:pPr>
-      <w:r>
-        <w:rPr>
-          <w:rFonts w:ascii="Arial" w:cs="Arial" w:eastAsia="Arial" w:hAnsi="Arial"/>
-          <w:color w:val="666666"/>
-          <w:sz w:val="20"/>
-          <w:szCs w:val="20"/>
-        </w:rPr>
-        <w:t xml:space="preserve">· </w:t>
-      </w:r>
-      <w:r>
-        <w:rPr>
-          <w:rFonts w:ascii="Arial" w:cs="Arial" w:eastAsia="Arial" w:hAnsi="Arial"/>
-          <w:color w:val="1A1A1A"/>
-          <w:sz w:val="19"/>
-          <w:szCs w:val="19"/>
-        </w:rPr>
-        <w:t xml:space="preserve">Anpassungen auf Basis direktem Nutzerfeedback</w:t>
+        <w:t xml:space="preserve">Bundeswehr</w:t>
+      </w:r>
+    </w:p>
+    <w:p>
+      <w:pPr>
+        <w:spacing w:after="36"/>
+      </w:pPr>
+      <w:r>
+        <w:rPr>
+          <w:rFonts w:ascii="Arial" w:cs="Arial" w:eastAsia="Arial" w:hAnsi="Arial"/>
+          <w:color w:val="666666"/>
+          <w:sz w:val="20"/>
+          <w:szCs w:val="20"/>
+        </w:rPr>
+        <w:t xml:space="preserve">· </w:t>
+      </w:r>
+      <w:r>
+        <w:rPr>
+          <w:rFonts w:ascii="Arial" w:cs="Arial" w:eastAsia="Arial" w:hAnsi="Arial"/>
+          <w:color w:val="1A1A1A"/>
+          <w:sz w:val="19"/>
+          <w:szCs w:val="19"/>
+        </w:rPr>
+        <w:t xml:space="preserve">Sanitätsausbildung, Erste Hilfe, medizinische Versorgung</w:t>
       </w:r>
     </w:p>
     <w:p>
@@ -1159,7 +1067,7 @@
           <w:sz w:val="18"/>
           <w:szCs w:val="18"/>
         </w:rPr>
-        <w:t xml:space="preserve">2013 – 2015</w:t>
+        <w:t xml:space="preserve">1994 – 1997</w:t>
       </w:r>
       <w:r>
         <w:rPr>
@@ -1179,7 +1087,7 @@
           <w:sz w:val="20"/>
           <w:szCs w:val="20"/>
         </w:rPr>
-        <w:t xml:space="preserve">MPU-Berater &amp; Erste-Hilfe-Ausbilder</w:t>
+        <w:t xml:space="preserve">Ehrenamtlicher Rettungsdiensthelfer</w:t>
       </w:r>
     </w:p>
     <w:p>
@@ -1196,76 +1104,53 @@
           <w:sz w:val="18"/>
           <w:szCs w:val="18"/>
         </w:rPr>
-        <w:t xml:space="preserve">UPGRADE.EU GmbH, Frankfurt am Main</w:t>
-      </w:r>
-    </w:p>
-    <w:p>
-      <w:pPr>
-        <w:spacing w:after="36"/>
-      </w:pPr>
-      <w:r>
-        <w:rPr>
-          <w:rFonts w:ascii="Arial" w:cs="Arial" w:eastAsia="Arial" w:hAnsi="Arial"/>
-          <w:color w:val="666666"/>
-          <w:sz w:val="20"/>
-          <w:szCs w:val="20"/>
-        </w:rPr>
-        <w:t xml:space="preserve">· </w:t>
-      </w:r>
-      <w:r>
-        <w:rPr>
-          <w:rFonts w:ascii="Arial" w:cs="Arial" w:eastAsia="Arial" w:hAnsi="Arial"/>
-          <w:color w:val="1A1A1A"/>
-          <w:sz w:val="19"/>
-          <w:szCs w:val="19"/>
-        </w:rPr>
-        <w:t xml:space="preserve">Entwicklung individueller Vorbereitungskonzepte aus Verkehrsakten</w:t>
-      </w:r>
-    </w:p>
-    <w:p>
-      <w:pPr>
-        <w:spacing w:after="36"/>
-      </w:pPr>
-      <w:r>
-        <w:rPr>
-          <w:rFonts w:ascii="Arial" w:cs="Arial" w:eastAsia="Arial" w:hAnsi="Arial"/>
-          <w:color w:val="666666"/>
-          <w:sz w:val="20"/>
-          <w:szCs w:val="20"/>
-        </w:rPr>
-        <w:t xml:space="preserve">· </w:t>
-      </w:r>
-      <w:r>
-        <w:rPr>
-          <w:rFonts w:ascii="Arial" w:cs="Arial" w:eastAsia="Arial" w:hAnsi="Arial"/>
-          <w:color w:val="1A1A1A"/>
-          <w:sz w:val="19"/>
-          <w:szCs w:val="19"/>
-        </w:rPr>
-        <w:t xml:space="preserve">Begleitung von Kandidaten im MPU-Prozess</w:t>
-      </w:r>
-    </w:p>
-    <w:p>
-      <w:pPr>
-        <w:spacing w:after="36"/>
-      </w:pPr>
-      <w:r>
-        <w:rPr>
-          <w:rFonts w:ascii="Arial" w:cs="Arial" w:eastAsia="Arial" w:hAnsi="Arial"/>
-          <w:color w:val="666666"/>
-          <w:sz w:val="20"/>
-          <w:szCs w:val="20"/>
-        </w:rPr>
-        <w:t xml:space="preserve">· </w:t>
-      </w:r>
-      <w:r>
-        <w:rPr>
-          <w:rFonts w:ascii="Arial" w:cs="Arial" w:eastAsia="Arial" w:hAnsi="Arial"/>
-          <w:color w:val="1A1A1A"/>
-          <w:sz w:val="19"/>
-          <w:szCs w:val="19"/>
-        </w:rPr>
-        <w:t xml:space="preserve">Durchführung von Erste-Hilfe-Ausbildungen für Fahranfänger</w:t>
+        <w:t xml:space="preserve">Bayerisches Rotes Kreuz (BRK)</w:t>
+      </w:r>
+    </w:p>
+    <w:p>
+      <w:pPr>
+        <w:spacing w:after="36"/>
+      </w:pPr>
+      <w:r>
+        <w:rPr>
+          <w:rFonts w:ascii="Arial" w:cs="Arial" w:eastAsia="Arial" w:hAnsi="Arial"/>
+          <w:color w:val="666666"/>
+          <w:sz w:val="20"/>
+          <w:szCs w:val="20"/>
+        </w:rPr>
+        <w:t xml:space="preserve">· </w:t>
+      </w:r>
+      <w:r>
+        <w:rPr>
+          <w:rFonts w:ascii="Arial" w:cs="Arial" w:eastAsia="Arial" w:hAnsi="Arial"/>
+          <w:color w:val="1A1A1A"/>
+          <w:sz w:val="19"/>
+          <w:szCs w:val="19"/>
+        </w:rPr>
+        <w:t xml:space="preserve">Sanitätsdienst, Erste Hilfe, Patientenversorgung im Einsatz</w:t>
+      </w:r>
+    </w:p>
+    <w:p>
+      <w:pPr>
+        <w:spacing w:after="36"/>
+      </w:pPr>
+      <w:r>
+        <w:rPr>
+          <w:rFonts w:ascii="Arial" w:cs="Arial" w:eastAsia="Arial" w:hAnsi="Arial"/>
+          <w:color w:val="666666"/>
+          <w:sz w:val="20"/>
+          <w:szCs w:val="20"/>
+        </w:rPr>
+        <w:t xml:space="preserve">· </w:t>
+      </w:r>
+      <w:r>
+        <w:rPr>
+          <w:rFonts w:ascii="Arial" w:cs="Arial" w:eastAsia="Arial" w:hAnsi="Arial"/>
+          <w:color w:val="1A1A1A"/>
+          <w:sz w:val="19"/>
+          <w:szCs w:val="19"/>
+        </w:rPr>
+        <w:t xml:space="preserve">Ehrenamtliches Engagement parallel zur Schulzeit</w:t>
       </w:r>
     </w:p>
     <w:p>
@@ -1285,137 +1170,618 @@
           <w:sz w:val="18"/>
           <w:szCs w:val="18"/>
         </w:rPr>
-        <w:t xml:space="preserve">Kenntnisse</w:t>
-      </w:r>
-    </w:p>
-    <w:p>
-      <w:pPr>
-        <w:spacing w:after="50" w:before="0"/>
-        <w:jc w:val="left"/>
-      </w:pPr>
-      <w:r>
-        <w:rPr>
-          <w:rFonts w:ascii="Arial" w:cs="Arial" w:eastAsia="Arial" w:hAnsi="Arial"/>
-          <w:b/>
-          <w:bCs/>
-          <w:color w:val="1A1A1A"/>
-          <w:sz w:val="19"/>
-          <w:szCs w:val="19"/>
-        </w:rPr>
-        <w:t xml:space="preserve">Copywriting: </w:t>
-      </w:r>
-      <w:r>
-        <w:rPr>
-          <w:rFonts w:ascii="Arial" w:cs="Arial" w:eastAsia="Arial" w:hAnsi="Arial"/>
-          <w:color w:val="666666"/>
-          <w:sz w:val="19"/>
-          <w:szCs w:val="19"/>
-        </w:rPr>
-        <w:t xml:space="preserve">Conversion, Storytelling, Persuasion, Politische Texte, Behördenkommunikation</w:t>
-      </w:r>
-    </w:p>
-    <w:p>
-      <w:pPr>
-        <w:spacing w:after="50" w:before="0"/>
-        <w:jc w:val="left"/>
-      </w:pPr>
-      <w:r>
-        <w:rPr>
-          <w:rFonts w:ascii="Arial" w:cs="Arial" w:eastAsia="Arial" w:hAnsi="Arial"/>
-          <w:b/>
-          <w:bCs/>
-          <w:color w:val="1A1A1A"/>
-          <w:sz w:val="19"/>
-          <w:szCs w:val="19"/>
-        </w:rPr>
-        <w:t xml:space="preserve">Formate: </w:t>
-      </w:r>
-      <w:r>
-        <w:rPr>
-          <w:rFonts w:ascii="Arial" w:cs="Arial" w:eastAsia="Arial" w:hAnsi="Arial"/>
-          <w:color w:val="666666"/>
-          <w:sz w:val="19"/>
-          <w:szCs w:val="19"/>
-        </w:rPr>
-        <w:t xml:space="preserve">Landing Pages, E-Mails, Ads, Reports, Anträge, Juristische Schreiben</w:t>
-      </w:r>
-    </w:p>
-    <w:p>
-      <w:pPr>
-        <w:spacing w:after="50" w:before="0"/>
-        <w:jc w:val="left"/>
-      </w:pPr>
-      <w:r>
-        <w:rPr>
-          <w:rFonts w:ascii="Arial" w:cs="Arial" w:eastAsia="Arial" w:hAnsi="Arial"/>
-          <w:b/>
-          <w:bCs/>
-          <w:color w:val="1A1A1A"/>
-          <w:sz w:val="19"/>
-          <w:szCs w:val="19"/>
-        </w:rPr>
-        <w:t xml:space="preserve">Methode: </w:t>
-      </w:r>
-      <w:r>
-        <w:rPr>
-          <w:rFonts w:ascii="Arial" w:cs="Arial" w:eastAsia="Arial" w:hAnsi="Arial"/>
-          <w:color w:val="666666"/>
-          <w:sz w:val="19"/>
-          <w:szCs w:val="19"/>
-        </w:rPr>
-        <w:t xml:space="preserve">Zielgruppenrecherche, Argumentationsaufbau, Iteration</w:t>
-      </w:r>
-    </w:p>
-    <w:p>
-      <w:pPr>
-        <w:spacing w:after="50" w:before="0"/>
-        <w:jc w:val="left"/>
-      </w:pPr>
-      <w:r>
-        <w:rPr>
-          <w:rFonts w:ascii="Arial" w:cs="Arial" w:eastAsia="Arial" w:hAnsi="Arial"/>
-          <w:b/>
-          <w:bCs/>
-          <w:color w:val="1A1A1A"/>
-          <w:sz w:val="19"/>
-          <w:szCs w:val="19"/>
-        </w:rPr>
-        <w:t xml:space="preserve">KI &amp; Automatisierung: </w:t>
-      </w:r>
-      <w:r>
-        <w:rPr>
-          <w:rFonts w:ascii="Arial" w:cs="Arial" w:eastAsia="Arial" w:hAnsi="Arial"/>
-          <w:color w:val="666666"/>
-          <w:sz w:val="19"/>
-          <w:szCs w:val="19"/>
-        </w:rPr>
-        <w:t xml:space="preserve">Prompt Engineering, LLM-Integration, KI-Vision, Agenten-Architektur · 7 Monate täglich</w:t>
-      </w:r>
-    </w:p>
-    <w:p>
-      <w:pPr>
-        <w:spacing w:after="50" w:before="0"/>
-        <w:jc w:val="left"/>
-      </w:pPr>
-      <w:r>
-        <w:rPr>
-          <w:rFonts w:ascii="Arial" w:cs="Arial" w:eastAsia="Arial" w:hAnsi="Arial"/>
-          <w:b/>
-          <w:bCs/>
-          <w:color w:val="1A1A1A"/>
-          <w:sz w:val="19"/>
-          <w:szCs w:val="19"/>
-        </w:rPr>
-        <w:t xml:space="preserve">Tools: </w:t>
-      </w:r>
-      <w:r>
-        <w:rPr>
-          <w:rFonts w:ascii="Arial" w:cs="Arial" w:eastAsia="Arial" w:hAnsi="Arial"/>
-          <w:color w:val="666666"/>
-          <w:sz w:val="19"/>
-          <w:szCs w:val="19"/>
-        </w:rPr>
-        <w:t xml:space="preserve">GitHub Pages, Moodle, Gumroad, Termux, SQLite, Telegram API</w:t>
+        <w:t xml:space="preserve">Projekte &amp; Selbstständige Tätigkeiten</w:t>
+      </w:r>
+    </w:p>
+    <w:p>
+      <w:pPr>
+        <w:spacing w:after="30" w:before="120"/>
+        <w:jc w:val="left"/>
+      </w:pPr>
+      <w:r>
+        <w:rPr>
+          <w:rFonts w:ascii="Arial" w:cs="Arial" w:eastAsia="Arial" w:hAnsi="Arial"/>
+          <w:color w:val="666666"/>
+          <w:sz w:val="18"/>
+          <w:szCs w:val="18"/>
+        </w:rPr>
+        <w:t xml:space="preserve">06/2026 – heute</w:t>
+      </w:r>
+      <w:r>
+        <w:rPr>
+          <w:rFonts w:ascii="Arial" w:cs="Arial" w:eastAsia="Arial" w:hAnsi="Arial"/>
+          <w:color w:val="666666"/>
+          <w:sz w:val="18"/>
+          <w:szCs w:val="18"/>
+        </w:rPr>
+        <w:t xml:space="preserve">  |  </w:t>
+      </w:r>
+      <w:r>
+        <w:rPr>
+          <w:rFonts w:ascii="Arial" w:cs="Arial" w:eastAsia="Arial" w:hAnsi="Arial"/>
+          <w:b/>
+          <w:bCs/>
+          <w:color w:val="1A1A1A"/>
+          <w:sz w:val="20"/>
+          <w:szCs w:val="20"/>
+        </w:rPr>
+        <w:t xml:space="preserve">Co-Founder &amp; Copywriter</w:t>
+      </w:r>
+    </w:p>
+    <w:p>
+      <w:pPr>
+        <w:spacing w:after="50" w:before="0"/>
+        <w:jc w:val="left"/>
+      </w:pPr>
+      <w:r>
+        <w:rPr>
+          <w:rFonts w:ascii="Arial" w:cs="Arial" w:eastAsia="Arial" w:hAnsi="Arial"/>
+          <w:i/>
+          <w:iCs/>
+          <w:color w:val="666666"/>
+          <w:sz w:val="18"/>
+          <w:szCs w:val="18"/>
+        </w:rPr>
+        <w:t xml:space="preserve">Copy Code Agency · mit Tomasz Szafrański · copy.code.agency</w:t>
+      </w:r>
+    </w:p>
+    <w:p>
+      <w:pPr>
+        <w:spacing w:after="36"/>
+      </w:pPr>
+      <w:r>
+        <w:rPr>
+          <w:rFonts w:ascii="Arial" w:cs="Arial" w:eastAsia="Arial" w:hAnsi="Arial"/>
+          <w:color w:val="666666"/>
+          <w:sz w:val="20"/>
+          <w:szCs w:val="20"/>
+        </w:rPr>
+        <w:t xml:space="preserve">· </w:t>
+      </w:r>
+      <w:r>
+        <w:rPr>
+          <w:rFonts w:ascii="Arial" w:cs="Arial" w:eastAsia="Arial" w:hAnsi="Arial"/>
+          <w:color w:val="1A1A1A"/>
+          <w:sz w:val="19"/>
+          <w:szCs w:val="19"/>
+        </w:rPr>
+        <w:t xml:space="preserve">Conversion Copy, Brand &amp; SEO für drei digitale Produkte in der Startphase</w:t>
+      </w:r>
+    </w:p>
+    <w:p>
+      <w:pPr>
+        <w:spacing w:after="36"/>
+      </w:pPr>
+      <w:r>
+        <w:rPr>
+          <w:rFonts w:ascii="Arial" w:cs="Arial" w:eastAsia="Arial" w:hAnsi="Arial"/>
+          <w:color w:val="666666"/>
+          <w:sz w:val="20"/>
+          <w:szCs w:val="20"/>
+        </w:rPr>
+        <w:t xml:space="preserve">· </w:t>
+      </w:r>
+      <w:r>
+        <w:rPr>
+          <w:rFonts w:ascii="Arial" w:cs="Arial" w:eastAsia="Arial" w:hAnsi="Arial"/>
+          <w:color w:val="1A1A1A"/>
+          <w:sz w:val="19"/>
+          <w:szCs w:val="19"/>
+        </w:rPr>
+        <w:t xml:space="preserve">KI-CV-Optimizer, Value Bet SaaS, IT-Recruiting-Plattform · Frankfurt → Remote</w:t>
+      </w:r>
+    </w:p>
+    <w:p>
+      <w:pPr>
+        <w:spacing w:after="30" w:before="120"/>
+        <w:jc w:val="left"/>
+      </w:pPr>
+      <w:r>
+        <w:rPr>
+          <w:rFonts w:ascii="Arial" w:cs="Arial" w:eastAsia="Arial" w:hAnsi="Arial"/>
+          <w:color w:val="666666"/>
+          <w:sz w:val="18"/>
+          <w:szCs w:val="18"/>
+        </w:rPr>
+        <w:t xml:space="preserve">03/2026 – heute</w:t>
+      </w:r>
+      <w:r>
+        <w:rPr>
+          <w:rFonts w:ascii="Arial" w:cs="Arial" w:eastAsia="Arial" w:hAnsi="Arial"/>
+          <w:color w:val="666666"/>
+          <w:sz w:val="18"/>
+          <w:szCs w:val="18"/>
+        </w:rPr>
+        <w:t xml:space="preserve">  |  </w:t>
+      </w:r>
+      <w:r>
+        <w:rPr>
+          <w:rFonts w:ascii="Arial" w:cs="Arial" w:eastAsia="Arial" w:hAnsi="Arial"/>
+          <w:b/>
+          <w:bCs/>
+          <w:color w:val="1A1A1A"/>
+          <w:sz w:val="20"/>
+          <w:szCs w:val="20"/>
+        </w:rPr>
+        <w:t xml:space="preserve">Selbstständiger Energieberater &amp; Texter</w:t>
+      </w:r>
+    </w:p>
+    <w:p>
+      <w:pPr>
+        <w:spacing w:after="50" w:before="0"/>
+        <w:jc w:val="left"/>
+      </w:pPr>
+      <w:r>
+        <w:rPr>
+          <w:rFonts w:ascii="Arial" w:cs="Arial" w:eastAsia="Arial" w:hAnsi="Arial"/>
+          <w:i/>
+          <w:iCs/>
+          <w:color w:val="666666"/>
+          <w:sz w:val="18"/>
+          <w:szCs w:val="18"/>
+        </w:rPr>
+        <w:t xml:space="preserve">Frankfurt Energie / TELESON AG · frankfurt-energie.online</w:t>
+      </w:r>
+    </w:p>
+    <w:p>
+      <w:pPr>
+        <w:spacing w:after="36"/>
+      </w:pPr>
+      <w:r>
+        <w:rPr>
+          <w:rFonts w:ascii="Arial" w:cs="Arial" w:eastAsia="Arial" w:hAnsi="Arial"/>
+          <w:color w:val="666666"/>
+          <w:sz w:val="20"/>
+          <w:szCs w:val="20"/>
+        </w:rPr>
+        <w:t xml:space="preserve">· </w:t>
+      </w:r>
+      <w:r>
+        <w:rPr>
+          <w:rFonts w:ascii="Arial" w:cs="Arial" w:eastAsia="Arial" w:hAnsi="Arial"/>
+          <w:color w:val="1A1A1A"/>
+          <w:sz w:val="19"/>
+          <w:szCs w:val="19"/>
+        </w:rPr>
+        <w:t xml:space="preserve">Direktvertrieb von Strom- und Gastarifen als TELESON-Partner</w:t>
+      </w:r>
+    </w:p>
+    <w:p>
+      <w:pPr>
+        <w:spacing w:after="36"/>
+      </w:pPr>
+      <w:r>
+        <w:rPr>
+          <w:rFonts w:ascii="Arial" w:cs="Arial" w:eastAsia="Arial" w:hAnsi="Arial"/>
+          <w:color w:val="666666"/>
+          <w:sz w:val="20"/>
+          <w:szCs w:val="20"/>
+        </w:rPr>
+        <w:t xml:space="preserve">· </w:t>
+      </w:r>
+      <w:r>
+        <w:rPr>
+          <w:rFonts w:ascii="Arial" w:cs="Arial" w:eastAsia="Arial" w:hAnsi="Arial"/>
+          <w:color w:val="1A1A1A"/>
+          <w:sz w:val="19"/>
+          <w:szCs w:val="19"/>
+        </w:rPr>
+        <w:t xml:space="preserve">Erstellung von SEO-Texten, Tarifvergleichen und Angebotsinhalten</w:t>
+      </w:r>
+    </w:p>
+    <w:p>
+      <w:pPr>
+        <w:spacing w:after="30" w:before="120"/>
+        <w:jc w:val="left"/>
+      </w:pPr>
+      <w:r>
+        <w:rPr>
+          <w:rFonts w:ascii="Arial" w:cs="Arial" w:eastAsia="Arial" w:hAnsi="Arial"/>
+          <w:color w:val="666666"/>
+          <w:sz w:val="18"/>
+          <w:szCs w:val="18"/>
+        </w:rPr>
+        <w:t xml:space="preserve">2025 – heute</w:t>
+      </w:r>
+      <w:r>
+        <w:rPr>
+          <w:rFonts w:ascii="Arial" w:cs="Arial" w:eastAsia="Arial" w:hAnsi="Arial"/>
+          <w:color w:val="666666"/>
+          <w:sz w:val="18"/>
+          <w:szCs w:val="18"/>
+        </w:rPr>
+        <w:t xml:space="preserve">  |  </w:t>
+      </w:r>
+      <w:r>
+        <w:rPr>
+          <w:rFonts w:ascii="Arial" w:cs="Arial" w:eastAsia="Arial" w:hAnsi="Arial"/>
+          <w:b/>
+          <w:bCs/>
+          <w:color w:val="1A1A1A"/>
+          <w:sz w:val="20"/>
+          <w:szCs w:val="20"/>
+        </w:rPr>
+        <w:t xml:space="preserve">Ghostwriter &amp; Autor für Behördenkommunikation</w:t>
+      </w:r>
+    </w:p>
+    <w:p>
+      <w:pPr>
+        <w:spacing w:after="50" w:before="0"/>
+        <w:jc w:val="left"/>
+      </w:pPr>
+      <w:r>
+        <w:rPr>
+          <w:rFonts w:ascii="Arial" w:cs="Arial" w:eastAsia="Arial" w:hAnsi="Arial"/>
+          <w:i/>
+          <w:iCs/>
+          <w:color w:val="666666"/>
+          <w:sz w:val="18"/>
+          <w:szCs w:val="18"/>
+        </w:rPr>
+        <w:t xml:space="preserve">Freiberuflich, Frankfurt am Main</w:t>
+      </w:r>
+    </w:p>
+    <w:p>
+      <w:pPr>
+        <w:spacing w:after="36"/>
+      </w:pPr>
+      <w:r>
+        <w:rPr>
+          <w:rFonts w:ascii="Arial" w:cs="Arial" w:eastAsia="Arial" w:hAnsi="Arial"/>
+          <w:color w:val="666666"/>
+          <w:sz w:val="20"/>
+          <w:szCs w:val="20"/>
+        </w:rPr>
+        <w:t xml:space="preserve">· </w:t>
+      </w:r>
+      <w:r>
+        <w:rPr>
+          <w:rFonts w:ascii="Arial" w:cs="Arial" w:eastAsia="Arial" w:hAnsi="Arial"/>
+          <w:color w:val="1A1A1A"/>
+          <w:sz w:val="19"/>
+          <w:szCs w:val="19"/>
+        </w:rPr>
+        <w:t xml:space="preserve">Ghostwriting für Privatpersonen und Unternehmen</w:t>
+      </w:r>
+    </w:p>
+    <w:p>
+      <w:pPr>
+        <w:spacing w:after="36"/>
+      </w:pPr>
+      <w:r>
+        <w:rPr>
+          <w:rFonts w:ascii="Arial" w:cs="Arial" w:eastAsia="Arial" w:hAnsi="Arial"/>
+          <w:color w:val="666666"/>
+          <w:sz w:val="20"/>
+          <w:szCs w:val="20"/>
+        </w:rPr>
+        <w:t xml:space="preserve">· </w:t>
+      </w:r>
+      <w:r>
+        <w:rPr>
+          <w:rFonts w:ascii="Arial" w:cs="Arial" w:eastAsia="Arial" w:hAnsi="Arial"/>
+          <w:color w:val="1A1A1A"/>
+          <w:sz w:val="19"/>
+          <w:szCs w:val="19"/>
+        </w:rPr>
+        <w:t xml:space="preserve">Juristische und behördliche Korrespondenz, Widersprüche, Anwaltsschreiben</w:t>
+      </w:r>
+    </w:p>
+    <w:p>
+      <w:pPr>
+        <w:spacing w:after="30" w:before="120"/>
+        <w:jc w:val="left"/>
+      </w:pPr>
+      <w:r>
+        <w:rPr>
+          <w:rFonts w:ascii="Arial" w:cs="Arial" w:eastAsia="Arial" w:hAnsi="Arial"/>
+          <w:color w:val="666666"/>
+          <w:sz w:val="18"/>
+          <w:szCs w:val="18"/>
+        </w:rPr>
+        <w:t xml:space="preserve">2025 – 2026</w:t>
+      </w:r>
+      <w:r>
+        <w:rPr>
+          <w:rFonts w:ascii="Arial" w:cs="Arial" w:eastAsia="Arial" w:hAnsi="Arial"/>
+          <w:color w:val="666666"/>
+          <w:sz w:val="18"/>
+          <w:szCs w:val="18"/>
+        </w:rPr>
+        <w:t xml:space="preserve">  |  </w:t>
+      </w:r>
+      <w:r>
+        <w:rPr>
+          <w:rFonts w:ascii="Arial" w:cs="Arial" w:eastAsia="Arial" w:hAnsi="Arial"/>
+          <w:b/>
+          <w:bCs/>
+          <w:color w:val="1A1A1A"/>
+          <w:sz w:val="20"/>
+          <w:szCs w:val="20"/>
+        </w:rPr>
+        <w:t xml:space="preserve">Entwickler — CROWN v10 Value-Bet-System</w:t>
+      </w:r>
+    </w:p>
+    <w:p>
+      <w:pPr>
+        <w:spacing w:after="50" w:before="0"/>
+        <w:jc w:val="left"/>
+      </w:pPr>
+      <w:r>
+        <w:rPr>
+          <w:rFonts w:ascii="Arial" w:cs="Arial" w:eastAsia="Arial" w:hAnsi="Arial"/>
+          <w:i/>
+          <w:iCs/>
+          <w:color w:val="666666"/>
+          <w:sz w:val="18"/>
+          <w:szCs w:val="18"/>
+        </w:rPr>
+        <w:t xml:space="preserve">Eigenentwicklung (Termux / Android)</w:t>
+      </w:r>
+    </w:p>
+    <w:p>
+      <w:pPr>
+        <w:spacing w:after="36"/>
+      </w:pPr>
+      <w:r>
+        <w:rPr>
+          <w:rFonts w:ascii="Arial" w:cs="Arial" w:eastAsia="Arial" w:hAnsi="Arial"/>
+          <w:color w:val="666666"/>
+          <w:sz w:val="20"/>
+          <w:szCs w:val="20"/>
+        </w:rPr>
+        <w:t xml:space="preserve">· </w:t>
+      </w:r>
+      <w:r>
+        <w:rPr>
+          <w:rFonts w:ascii="Arial" w:cs="Arial" w:eastAsia="Arial" w:hAnsi="Arial"/>
+          <w:color w:val="1A1A1A"/>
+          <w:sz w:val="19"/>
+          <w:szCs w:val="19"/>
+        </w:rPr>
+        <w:t xml:space="preserve">Datengetriebenes Analyse- und Entscheidungssystem mit Telegram-Bot, SQLite, Multi-Threading</w:t>
+      </w:r>
+    </w:p>
+    <w:p>
+      <w:pPr>
+        <w:spacing w:after="36"/>
+      </w:pPr>
+      <w:r>
+        <w:rPr>
+          <w:rFonts w:ascii="Arial" w:cs="Arial" w:eastAsia="Arial" w:hAnsi="Arial"/>
+          <w:color w:val="666666"/>
+          <w:sz w:val="20"/>
+          <w:szCs w:val="20"/>
+        </w:rPr>
+        <w:t xml:space="preserve">· </w:t>
+      </w:r>
+      <w:r>
+        <w:rPr>
+          <w:rFonts w:ascii="Arial" w:cs="Arial" w:eastAsia="Arial" w:hAnsi="Arial"/>
+          <w:color w:val="1A1A1A"/>
+          <w:sz w:val="19"/>
+          <w:szCs w:val="19"/>
+        </w:rPr>
+        <w:t xml:space="preserve">Kelly-Criterion-Sizing und automatische GitHub-Backups</w:t>
+      </w:r>
+    </w:p>
+    <w:p>
+      <w:pPr>
+        <w:spacing w:after="30" w:before="120"/>
+        <w:jc w:val="left"/>
+      </w:pPr>
+      <w:r>
+        <w:rPr>
+          <w:rFonts w:ascii="Arial" w:cs="Arial" w:eastAsia="Arial" w:hAnsi="Arial"/>
+          <w:color w:val="666666"/>
+          <w:sz w:val="18"/>
+          <w:szCs w:val="18"/>
+        </w:rPr>
+        <w:t xml:space="preserve">2016 – heute</w:t>
+      </w:r>
+      <w:r>
+        <w:rPr>
+          <w:rFonts w:ascii="Arial" w:cs="Arial" w:eastAsia="Arial" w:hAnsi="Arial"/>
+          <w:color w:val="666666"/>
+          <w:sz w:val="18"/>
+          <w:szCs w:val="18"/>
+        </w:rPr>
+        <w:t xml:space="preserve">  |  </w:t>
+      </w:r>
+      <w:r>
+        <w:rPr>
+          <w:rFonts w:ascii="Arial" w:cs="Arial" w:eastAsia="Arial" w:hAnsi="Arial"/>
+          <w:b/>
+          <w:bCs/>
+          <w:color w:val="1A1A1A"/>
+          <w:sz w:val="20"/>
+          <w:szCs w:val="20"/>
+        </w:rPr>
+        <w:t xml:space="preserve">Politischer Texter &amp; Ghostwriter</w:t>
+      </w:r>
+    </w:p>
+    <w:p>
+      <w:pPr>
+        <w:spacing w:after="50" w:before="0"/>
+        <w:jc w:val="left"/>
+      </w:pPr>
+      <w:r>
+        <w:rPr>
+          <w:rFonts w:ascii="Arial" w:cs="Arial" w:eastAsia="Arial" w:hAnsi="Arial"/>
+          <w:i/>
+          <w:iCs/>
+          <w:color w:val="666666"/>
+          <w:sz w:val="18"/>
+          <w:szCs w:val="18"/>
+        </w:rPr>
+        <w:t xml:space="preserve">BFF Bürger für Frankfurt e. V. / Freie Wähler Frankfurt</w:t>
+      </w:r>
+    </w:p>
+    <w:p>
+      <w:pPr>
+        <w:spacing w:after="36"/>
+      </w:pPr>
+      <w:r>
+        <w:rPr>
+          <w:rFonts w:ascii="Arial" w:cs="Arial" w:eastAsia="Arial" w:hAnsi="Arial"/>
+          <w:color w:val="666666"/>
+          <w:sz w:val="20"/>
+          <w:szCs w:val="20"/>
+        </w:rPr>
+        <w:t xml:space="preserve">· </w:t>
+      </w:r>
+      <w:r>
+        <w:rPr>
+          <w:rFonts w:ascii="Arial" w:cs="Arial" w:eastAsia="Arial" w:hAnsi="Arial"/>
+          <w:color w:val="1A1A1A"/>
+          <w:sz w:val="19"/>
+          <w:szCs w:val="19"/>
+        </w:rPr>
+        <w:t xml:space="preserve">Erstellung offizieller Anträge für den Ortsbeirat 10</w:t>
+      </w:r>
+    </w:p>
+    <w:p>
+      <w:pPr>
+        <w:spacing w:after="36"/>
+      </w:pPr>
+      <w:r>
+        <w:rPr>
+          <w:rFonts w:ascii="Arial" w:cs="Arial" w:eastAsia="Arial" w:hAnsi="Arial"/>
+          <w:color w:val="666666"/>
+          <w:sz w:val="20"/>
+          <w:szCs w:val="20"/>
+        </w:rPr>
+        <w:t xml:space="preserve">· </w:t>
+      </w:r>
+      <w:r>
+        <w:rPr>
+          <w:rFonts w:ascii="Arial" w:cs="Arial" w:eastAsia="Arial" w:hAnsi="Arial"/>
+          <w:color w:val="1A1A1A"/>
+          <w:sz w:val="19"/>
+          <w:szCs w:val="19"/>
+        </w:rPr>
+        <w:t xml:space="preserve">Wahlprogramm der Freien Wähler Frankfurt 2026 vollständig neu geschrieben</w:t>
+      </w:r>
+    </w:p>
+    <w:p>
+      <w:pPr>
+        <w:spacing w:after="36"/>
+      </w:pPr>
+      <w:r>
+        <w:rPr>
+          <w:rFonts w:ascii="Arial" w:cs="Arial" w:eastAsia="Arial" w:hAnsi="Arial"/>
+          <w:color w:val="666666"/>
+          <w:sz w:val="20"/>
+          <w:szCs w:val="20"/>
+        </w:rPr>
+        <w:t xml:space="preserve">· </w:t>
+      </w:r>
+      <w:r>
+        <w:rPr>
+          <w:rFonts w:ascii="Arial" w:cs="Arial" w:eastAsia="Arial" w:hAnsi="Arial"/>
+          <w:color w:val="1A1A1A"/>
+          <w:sz w:val="19"/>
+          <w:szCs w:val="19"/>
+        </w:rPr>
+        <w:t xml:space="preserve">Listenkandidat Platz 4 (Stadtverordnetenversammlung) / Platz 2 (Ortsbeirat)</w:t>
+      </w:r>
+    </w:p>
+    <w:p>
+      <w:pPr>
+        <w:spacing w:after="30" w:before="120"/>
+        <w:jc w:val="left"/>
+      </w:pPr>
+      <w:r>
+        <w:rPr>
+          <w:rFonts w:ascii="Arial" w:cs="Arial" w:eastAsia="Arial" w:hAnsi="Arial"/>
+          <w:color w:val="666666"/>
+          <w:sz w:val="18"/>
+          <w:szCs w:val="18"/>
+        </w:rPr>
+        <w:t xml:space="preserve">2024 – heute</w:t>
+      </w:r>
+      <w:r>
+        <w:rPr>
+          <w:rFonts w:ascii="Arial" w:cs="Arial" w:eastAsia="Arial" w:hAnsi="Arial"/>
+          <w:color w:val="666666"/>
+          <w:sz w:val="18"/>
+          <w:szCs w:val="18"/>
+        </w:rPr>
+        <w:t xml:space="preserve">  |  </w:t>
+      </w:r>
+      <w:r>
+        <w:rPr>
+          <w:rFonts w:ascii="Arial" w:cs="Arial" w:eastAsia="Arial" w:hAnsi="Arial"/>
+          <w:b/>
+          <w:bCs/>
+          <w:color w:val="1A1A1A"/>
+          <w:sz w:val="20"/>
+          <w:szCs w:val="20"/>
+        </w:rPr>
+        <w:t xml:space="preserve">Mitgründer &amp; Texter</w:t>
+      </w:r>
+    </w:p>
+    <w:p>
+      <w:pPr>
+        <w:spacing w:after="50" w:before="0"/>
+        <w:jc w:val="left"/>
+      </w:pPr>
+      <w:r>
+        <w:rPr>
+          <w:rFonts w:ascii="Arial" w:cs="Arial" w:eastAsia="Arial" w:hAnsi="Arial"/>
+          <w:i/>
+          <w:iCs/>
+          <w:color w:val="666666"/>
+          <w:sz w:val="18"/>
+          <w:szCs w:val="18"/>
+        </w:rPr>
+        <w:t xml:space="preserve">BanglaHilfe Deutschland (im Aufbau)</w:t>
+      </w:r>
+    </w:p>
+    <w:p>
+      <w:pPr>
+        <w:spacing w:after="36"/>
+      </w:pPr>
+      <w:r>
+        <w:rPr>
+          <w:rFonts w:ascii="Arial" w:cs="Arial" w:eastAsia="Arial" w:hAnsi="Arial"/>
+          <w:color w:val="666666"/>
+          <w:sz w:val="20"/>
+          <w:szCs w:val="20"/>
+        </w:rPr>
+        <w:t xml:space="preserve">· </w:t>
+      </w:r>
+      <w:r>
+        <w:rPr>
+          <w:rFonts w:ascii="Arial" w:cs="Arial" w:eastAsia="Arial" w:hAnsi="Arial"/>
+          <w:color w:val="1A1A1A"/>
+          <w:sz w:val="19"/>
+          <w:szCs w:val="19"/>
+        </w:rPr>
+        <w:t xml:space="preserve">Zweisprachige Serviceplattform DE/Bengali für bangladeschische Arbeitsmigrantinnen</w:t>
+      </w:r>
+    </w:p>
+    <w:p>
+      <w:pPr>
+        <w:spacing w:after="36"/>
+      </w:pPr>
+      <w:r>
+        <w:rPr>
+          <w:rFonts w:ascii="Arial" w:cs="Arial" w:eastAsia="Arial" w:hAnsi="Arial"/>
+          <w:color w:val="666666"/>
+          <w:sz w:val="20"/>
+          <w:szCs w:val="20"/>
+        </w:rPr>
+        <w:t xml:space="preserve">· </w:t>
+      </w:r>
+      <w:r>
+        <w:rPr>
+          <w:rFonts w:ascii="Arial" w:cs="Arial" w:eastAsia="Arial" w:hAnsi="Arial"/>
+          <w:color w:val="1A1A1A"/>
+          <w:sz w:val="19"/>
+          <w:szCs w:val="19"/>
+        </w:rPr>
+        <w:t xml:space="preserve">Texte, Struktur, Lead-Magnete und Stripe-Integration eigenständig entwickelt</w:t>
       </w:r>
     </w:p>
     <w:p>
@@ -1435,85 +1801,137 @@
           <w:sz w:val="18"/>
           <w:szCs w:val="18"/>
         </w:rPr>
-        <w:t xml:space="preserve">Sprachen</w:t>
-      </w:r>
-    </w:p>
-    <w:p>
-      <w:pPr>
-        <w:spacing w:after="50" w:before="0"/>
-        <w:jc w:val="left"/>
-      </w:pPr>
-      <w:r>
-        <w:rPr>
-          <w:rFonts w:ascii="Arial" w:cs="Arial" w:eastAsia="Arial" w:hAnsi="Arial"/>
-          <w:b/>
-          <w:bCs/>
-          <w:color w:val="1A1A1A"/>
-          <w:sz w:val="19"/>
-          <w:szCs w:val="19"/>
-        </w:rPr>
-        <w:t xml:space="preserve">Deutsch: </w:t>
-      </w:r>
-      <w:r>
-        <w:rPr>
-          <w:rFonts w:ascii="Arial" w:cs="Arial" w:eastAsia="Arial" w:hAnsi="Arial"/>
-          <w:color w:val="666666"/>
-          <w:sz w:val="19"/>
-          <w:szCs w:val="19"/>
-        </w:rPr>
-        <w:t xml:space="preserve">Muttersprache</w:t>
-      </w:r>
-    </w:p>
-    <w:p>
-      <w:pPr>
-        <w:spacing w:after="50" w:before="0"/>
-        <w:jc w:val="left"/>
-      </w:pPr>
-      <w:r>
-        <w:rPr>
-          <w:rFonts w:ascii="Arial" w:cs="Arial" w:eastAsia="Arial" w:hAnsi="Arial"/>
-          <w:b/>
-          <w:bCs/>
-          <w:color w:val="1A1A1A"/>
-          <w:sz w:val="19"/>
-          <w:szCs w:val="19"/>
-        </w:rPr>
-        <w:t xml:space="preserve">Englisch: </w:t>
-      </w:r>
-      <w:r>
-        <w:rPr>
-          <w:rFonts w:ascii="Arial" w:cs="Arial" w:eastAsia="Arial" w:hAnsi="Arial"/>
-          <w:color w:val="666666"/>
-          <w:sz w:val="19"/>
-          <w:szCs w:val="19"/>
-        </w:rPr>
-        <w:t xml:space="preserve">Fließend · Cambridge C1 Advanced (CAE)</w:t>
-      </w:r>
-    </w:p>
-    <w:p>
-      <w:pPr>
-        <w:spacing w:after="50" w:before="0"/>
-        <w:jc w:val="left"/>
-      </w:pPr>
-      <w:r>
-        <w:rPr>
-          <w:rFonts w:ascii="Arial" w:cs="Arial" w:eastAsia="Arial" w:hAnsi="Arial"/>
-          <w:b/>
-          <w:bCs/>
-          <w:color w:val="1A1A1A"/>
-          <w:sz w:val="19"/>
-          <w:szCs w:val="19"/>
-        </w:rPr>
-        <w:t xml:space="preserve">Französisch: </w:t>
-      </w:r>
-      <w:r>
-        <w:rPr>
-          <w:rFonts w:ascii="Arial" w:cs="Arial" w:eastAsia="Arial" w:hAnsi="Arial"/>
-          <w:color w:val="666666"/>
-          <w:sz w:val="19"/>
-          <w:szCs w:val="19"/>
-        </w:rPr>
-        <w:t xml:space="preserve">Grundkenntnisse</w:t>
+        <w:t xml:space="preserve">Kenntnisse</w:t>
+      </w:r>
+    </w:p>
+    <w:p>
+      <w:pPr>
+        <w:spacing w:after="50" w:before="0"/>
+        <w:jc w:val="left"/>
+      </w:pPr>
+      <w:r>
+        <w:rPr>
+          <w:rFonts w:ascii="Arial" w:cs="Arial" w:eastAsia="Arial" w:hAnsi="Arial"/>
+          <w:b/>
+          <w:bCs/>
+          <w:color w:val="1A1A1A"/>
+          <w:sz w:val="19"/>
+          <w:szCs w:val="19"/>
+        </w:rPr>
+        <w:t xml:space="preserve">Copywriting: </w:t>
+      </w:r>
+      <w:r>
+        <w:rPr>
+          <w:rFonts w:ascii="Arial" w:cs="Arial" w:eastAsia="Arial" w:hAnsi="Arial"/>
+          <w:color w:val="666666"/>
+          <w:sz w:val="19"/>
+          <w:szCs w:val="19"/>
+        </w:rPr>
+        <w:t xml:space="preserve">Conversion, Storytelling, Persuasion, Politische Texte, Behördenkommunikation</w:t>
+      </w:r>
+    </w:p>
+    <w:p>
+      <w:pPr>
+        <w:spacing w:after="50" w:before="0"/>
+        <w:jc w:val="left"/>
+      </w:pPr>
+      <w:r>
+        <w:rPr>
+          <w:rFonts w:ascii="Arial" w:cs="Arial" w:eastAsia="Arial" w:hAnsi="Arial"/>
+          <w:b/>
+          <w:bCs/>
+          <w:color w:val="1A1A1A"/>
+          <w:sz w:val="19"/>
+          <w:szCs w:val="19"/>
+        </w:rPr>
+        <w:t xml:space="preserve">Formate: </w:t>
+      </w:r>
+      <w:r>
+        <w:rPr>
+          <w:rFonts w:ascii="Arial" w:cs="Arial" w:eastAsia="Arial" w:hAnsi="Arial"/>
+          <w:color w:val="666666"/>
+          <w:sz w:val="19"/>
+          <w:szCs w:val="19"/>
+        </w:rPr>
+        <w:t xml:space="preserve">Landing Pages, E-Mails, Ads, Reports, Anträge, Juristische Schreiben</w:t>
+      </w:r>
+    </w:p>
+    <w:p>
+      <w:pPr>
+        <w:spacing w:after="50" w:before="0"/>
+        <w:jc w:val="left"/>
+      </w:pPr>
+      <w:r>
+        <w:rPr>
+          <w:rFonts w:ascii="Arial" w:cs="Arial" w:eastAsia="Arial" w:hAnsi="Arial"/>
+          <w:b/>
+          <w:bCs/>
+          <w:color w:val="1A1A1A"/>
+          <w:sz w:val="19"/>
+          <w:szCs w:val="19"/>
+        </w:rPr>
+        <w:t xml:space="preserve">Methode: </w:t>
+      </w:r>
+      <w:r>
+        <w:rPr>
+          <w:rFonts w:ascii="Arial" w:cs="Arial" w:eastAsia="Arial" w:hAnsi="Arial"/>
+          <w:color w:val="666666"/>
+          <w:sz w:val="19"/>
+          <w:szCs w:val="19"/>
+        </w:rPr>
+        <w:t xml:space="preserve">Zielgruppenrecherche, Argumentationsaufbau, Iteration</w:t>
+      </w:r>
+    </w:p>
+    <w:p>
+      <w:pPr>
+        <w:spacing w:after="50" w:before="0"/>
+        <w:jc w:val="left"/>
+      </w:pPr>
+      <w:r>
+        <w:rPr>
+          <w:rFonts w:ascii="Arial" w:cs="Arial" w:eastAsia="Arial" w:hAnsi="Arial"/>
+          <w:b/>
+          <w:bCs/>
+          <w:color w:val="1A1A1A"/>
+          <w:sz w:val="19"/>
+          <w:szCs w:val="19"/>
+        </w:rPr>
+        <w:t xml:space="preserve">KI &amp; Automatisierung: </w:t>
+      </w:r>
+      <w:r>
+        <w:rPr>
+          <w:rFonts w:ascii="Arial" w:cs="Arial" w:eastAsia="Arial" w:hAnsi="Arial"/>
+          <w:color w:val="666666"/>
+          <w:sz w:val="19"/>
+          <w:szCs w:val="19"/>
+        </w:rPr>
+        <w:t xml:space="preserve">Prompt Engineering, LLM-Integration, KI-Vision, Agenten-Architektur · 7 Monate täglich</w:t>
+      </w:r>
+    </w:p>
+    <w:p>
+      <w:pPr>
+        <w:spacing w:after="50" w:before="0"/>
+        <w:jc w:val="left"/>
+      </w:pPr>
+      <w:r>
+        <w:rPr>
+          <w:rFonts w:ascii="Arial" w:cs="Arial" w:eastAsia="Arial" w:hAnsi="Arial"/>
+          <w:b/>
+          <w:bCs/>
+          <w:color w:val="1A1A1A"/>
+          <w:sz w:val="19"/>
+          <w:szCs w:val="19"/>
+        </w:rPr>
+        <w:t xml:space="preserve">Tools: </w:t>
+      </w:r>
+      <w:r>
+        <w:rPr>
+          <w:rFonts w:ascii="Arial" w:cs="Arial" w:eastAsia="Arial" w:hAnsi="Arial"/>
+          <w:color w:val="666666"/>
+          <w:sz w:val="19"/>
+          <w:szCs w:val="19"/>
+        </w:rPr>
+        <w:t xml:space="preserve">GitHub Pages, Moodle, Gumroad, Termux, SQLite, Telegram API</w:t>
       </w:r>
     </w:p>
     <w:p>
@@ -1533,6 +1951,104 @@
           <w:sz w:val="18"/>
           <w:szCs w:val="18"/>
         </w:rPr>
+        <w:t xml:space="preserve">Sprachen</w:t>
+      </w:r>
+    </w:p>
+    <w:p>
+      <w:pPr>
+        <w:spacing w:after="50" w:before="0"/>
+        <w:jc w:val="left"/>
+      </w:pPr>
+      <w:r>
+        <w:rPr>
+          <w:rFonts w:ascii="Arial" w:cs="Arial" w:eastAsia="Arial" w:hAnsi="Arial"/>
+          <w:b/>
+          <w:bCs/>
+          <w:color w:val="1A1A1A"/>
+          <w:sz w:val="19"/>
+          <w:szCs w:val="19"/>
+        </w:rPr>
+        <w:t xml:space="preserve">Deutsch: </w:t>
+      </w:r>
+      <w:r>
+        <w:rPr>
+          <w:rFonts w:ascii="Arial" w:cs="Arial" w:eastAsia="Arial" w:hAnsi="Arial"/>
+          <w:color w:val="666666"/>
+          <w:sz w:val="19"/>
+          <w:szCs w:val="19"/>
+        </w:rPr>
+        <w:t xml:space="preserve">Muttersprache</w:t>
+      </w:r>
+    </w:p>
+    <w:p>
+      <w:pPr>
+        <w:spacing w:after="50" w:before="0"/>
+        <w:jc w:val="left"/>
+      </w:pPr>
+      <w:r>
+        <w:rPr>
+          <w:rFonts w:ascii="Arial" w:cs="Arial" w:eastAsia="Arial" w:hAnsi="Arial"/>
+          <w:b/>
+          <w:bCs/>
+          <w:color w:val="1A1A1A"/>
+          <w:sz w:val="19"/>
+          <w:szCs w:val="19"/>
+        </w:rPr>
+        <w:t xml:space="preserve">Englisch: </w:t>
+      </w:r>
+      <w:r>
+        <w:rPr>
+          <w:rFonts w:ascii="Arial" w:cs="Arial" w:eastAsia="Arial" w:hAnsi="Arial"/>
+          <w:color w:val="666666"/>
+          <w:sz w:val="19"/>
+          <w:szCs w:val="19"/>
+        </w:rPr>
+        <w:t xml:space="preserve">Fließend · Cambridge C1 Advanced (CAE)</w:t>
+      </w:r>
+    </w:p>
+    <w:p>
+      <w:pPr>
+        <w:spacing w:after="50" w:before="0"/>
+        <w:jc w:val="left"/>
+      </w:pPr>
+      <w:r>
+        <w:rPr>
+          <w:rFonts w:ascii="Arial" w:cs="Arial" w:eastAsia="Arial" w:hAnsi="Arial"/>
+          <w:b/>
+          <w:bCs/>
+          <w:color w:val="1A1A1A"/>
+          <w:sz w:val="19"/>
+          <w:szCs w:val="19"/>
+        </w:rPr>
+        <w:t xml:space="preserve">Französisch: </w:t>
+      </w:r>
+      <w:r>
+        <w:rPr>
+          <w:rFonts w:ascii="Arial" w:cs="Arial" w:eastAsia="Arial" w:hAnsi="Arial"/>
+          <w:color w:val="666666"/>
+          <w:sz w:val="19"/>
+          <w:szCs w:val="19"/>
+        </w:rPr>
+        <w:t xml:space="preserve">Grundkenntnisse</w:t>
+      </w:r>
+    </w:p>
+    <w:p>
+      <w:pPr>
+        <w:pBdr>
+          <w:bottom w:val="single" w:color="CCCCCC" w:sz="3" w:space="1"/>
+        </w:pBdr>
+        <w:spacing w:after="100" w:before="260"/>
+      </w:pPr>
+      <w:r>
+        <w:rPr>
+          <w:rFonts w:ascii="Arial" w:cs="Arial" w:eastAsia="Arial" w:hAnsi="Arial"/>
+          <w:b/>
+          <w:bCs/>
+          <w:caps/>
+          <w:color w:val="555555"/>
+          <w:sz w:val="18"/>
+          <w:szCs w:val="18"/>
+        </w:rPr>
         <w:t xml:space="preserve">Ausbildung &amp; Qualifikationen</w:t>
       </w:r>
     </w:p>
@@ -1793,7 +2309,7 @@
           <w:sz w:val="20"/>
           <w:szCs w:val="20"/>
         </w:rPr>
-        <w:t xml:space="preserve">Englisch-Nachhilfelehrer</w:t>
+        <w:t xml:space="preserve">Englisch-Nachhilfelehrer (nebenberuflich)</w:t>
       </w:r>
     </w:p>
     <w:p>
@@ -1857,6 +2373,202 @@
           <w:szCs w:val="19"/>
         </w:rPr>
         <w:t xml:space="preserve">Altersgerechte Handouts und Übungsblätter eigenständig entwickelt</w:t>
+      </w:r>
+    </w:p>
+    <w:p>
+      <w:pPr>
+        <w:spacing w:after="30" w:before="120"/>
+        <w:jc w:val="left"/>
+      </w:pPr>
+      <w:r>
+        <w:rPr>
+          <w:rFonts w:ascii="Arial" w:cs="Arial" w:eastAsia="Arial" w:hAnsi="Arial"/>
+          <w:color w:val="666666"/>
+          <w:sz w:val="18"/>
+          <w:szCs w:val="18"/>
+        </w:rPr>
+        <w:t xml:space="preserve">1998 – 2001</w:t>
+      </w:r>
+      <w:r>
+        <w:rPr>
+          <w:rFonts w:ascii="Arial" w:cs="Arial" w:eastAsia="Arial" w:hAnsi="Arial"/>
+          <w:color w:val="666666"/>
+          <w:sz w:val="18"/>
+          <w:szCs w:val="18"/>
+        </w:rPr>
+        <w:t xml:space="preserve">  |  </w:t>
+      </w:r>
+      <w:r>
+        <w:rPr>
+          <w:rFonts w:ascii="Arial" w:cs="Arial" w:eastAsia="Arial" w:hAnsi="Arial"/>
+          <w:b/>
+          <w:bCs/>
+          <w:color w:val="1A1A1A"/>
+          <w:sz w:val="20"/>
+          <w:szCs w:val="20"/>
+        </w:rPr>
+        <w:t xml:space="preserve">Selbstständiger Vermögensberater (nebenberuflich)</w:t>
+      </w:r>
+    </w:p>
+    <w:p>
+      <w:pPr>
+        <w:spacing w:after="50" w:before="0"/>
+        <w:jc w:val="left"/>
+      </w:pPr>
+      <w:r>
+        <w:rPr>
+          <w:rFonts w:ascii="Arial" w:cs="Arial" w:eastAsia="Arial" w:hAnsi="Arial"/>
+          <w:i/>
+          <w:iCs/>
+          <w:color w:val="666666"/>
+          <w:sz w:val="18"/>
+          <w:szCs w:val="18"/>
+        </w:rPr>
+        <w:t xml:space="preserve">Deutsche Vermögensberatung AG (DVAG)</w:t>
+      </w:r>
+    </w:p>
+    <w:p>
+      <w:pPr>
+        <w:spacing w:after="36"/>
+      </w:pPr>
+      <w:r>
+        <w:rPr>
+          <w:rFonts w:ascii="Arial" w:cs="Arial" w:eastAsia="Arial" w:hAnsi="Arial"/>
+          <w:color w:val="666666"/>
+          <w:sz w:val="20"/>
+          <w:szCs w:val="20"/>
+        </w:rPr>
+        <w:t xml:space="preserve">· </w:t>
+      </w:r>
+      <w:r>
+        <w:rPr>
+          <w:rFonts w:ascii="Arial" w:cs="Arial" w:eastAsia="Arial" w:hAnsi="Arial"/>
+          <w:color w:val="1A1A1A"/>
+          <w:sz w:val="19"/>
+          <w:szCs w:val="19"/>
+        </w:rPr>
+        <w:t xml:space="preserve">Beratung von Privatkunden zu Versicherungs- und Finanzprodukten</w:t>
+      </w:r>
+    </w:p>
+    <w:p>
+      <w:pPr>
+        <w:spacing w:after="36"/>
+      </w:pPr>
+      <w:r>
+        <w:rPr>
+          <w:rFonts w:ascii="Arial" w:cs="Arial" w:eastAsia="Arial" w:hAnsi="Arial"/>
+          <w:color w:val="666666"/>
+          <w:sz w:val="20"/>
+          <w:szCs w:val="20"/>
+        </w:rPr>
+        <w:t xml:space="preserve">· </w:t>
+      </w:r>
+      <w:r>
+        <w:rPr>
+          <w:rFonts w:ascii="Arial" w:cs="Arial" w:eastAsia="Arial" w:hAnsi="Arial"/>
+          <w:color w:val="1A1A1A"/>
+          <w:sz w:val="19"/>
+          <w:szCs w:val="19"/>
+        </w:rPr>
+        <w:t xml:space="preserve">Eigenständige Kundengewinnung und Beziehungspflege</w:t>
+      </w:r>
+    </w:p>
+    <w:p>
+      <w:pPr>
+        <w:spacing w:after="30" w:before="120"/>
+        <w:jc w:val="left"/>
+      </w:pPr>
+      <w:r>
+        <w:rPr>
+          <w:rFonts w:ascii="Arial" w:cs="Arial" w:eastAsia="Arial" w:hAnsi="Arial"/>
+          <w:color w:val="666666"/>
+          <w:sz w:val="18"/>
+          <w:szCs w:val="18"/>
+        </w:rPr>
+        <w:t xml:space="preserve">2001 – 2010</w:t>
+      </w:r>
+      <w:r>
+        <w:rPr>
+          <w:rFonts w:ascii="Arial" w:cs="Arial" w:eastAsia="Arial" w:hAnsi="Arial"/>
+          <w:color w:val="666666"/>
+          <w:sz w:val="18"/>
+          <w:szCs w:val="18"/>
+        </w:rPr>
+        <w:t xml:space="preserve">  |  </w:t>
+      </w:r>
+      <w:r>
+        <w:rPr>
+          <w:rFonts w:ascii="Arial" w:cs="Arial" w:eastAsia="Arial" w:hAnsi="Arial"/>
+          <w:b/>
+          <w:bCs/>
+          <w:color w:val="1A1A1A"/>
+          <w:sz w:val="20"/>
+          <w:szCs w:val="20"/>
+        </w:rPr>
+        <w:t xml:space="preserve">Produktionsmitarbeiter / Versand</w:t>
+      </w:r>
+    </w:p>
+    <w:p>
+      <w:pPr>
+        <w:spacing w:after="50" w:before="0"/>
+        <w:jc w:val="left"/>
+      </w:pPr>
+      <w:r>
+        <w:rPr>
+          <w:rFonts w:ascii="Arial" w:cs="Arial" w:eastAsia="Arial" w:hAnsi="Arial"/>
+          <w:i/>
+          <w:iCs/>
+          <w:color w:val="666666"/>
+          <w:sz w:val="18"/>
+          <w:szCs w:val="18"/>
+        </w:rPr>
+        <w:t xml:space="preserve">Valeo Kronach</w:t>
+      </w:r>
+    </w:p>
+    <w:p>
+      <w:pPr>
+        <w:spacing w:after="36"/>
+      </w:pPr>
+      <w:r>
+        <w:rPr>
+          <w:rFonts w:ascii="Arial" w:cs="Arial" w:eastAsia="Arial" w:hAnsi="Arial"/>
+          <w:color w:val="666666"/>
+          <w:sz w:val="20"/>
+          <w:szCs w:val="20"/>
+        </w:rPr>
+        <w:t xml:space="preserve">· </w:t>
+      </w:r>
+      <w:r>
+        <w:rPr>
+          <w:rFonts w:ascii="Arial" w:cs="Arial" w:eastAsia="Arial" w:hAnsi="Arial"/>
+          <w:color w:val="1A1A1A"/>
+          <w:sz w:val="19"/>
+          <w:szCs w:val="19"/>
+        </w:rPr>
+        <w:t xml:space="preserve">Fertigung und Versandlogistik in der Automobilzulieferindustrie</w:t>
+      </w:r>
+    </w:p>
+    <w:p>
+      <w:pPr>
+        <w:spacing w:after="36"/>
+      </w:pPr>
+      <w:r>
+        <w:rPr>
+          <w:rFonts w:ascii="Arial" w:cs="Arial" w:eastAsia="Arial" w:hAnsi="Arial"/>
+          <w:color w:val="666666"/>
+          <w:sz w:val="20"/>
+          <w:szCs w:val="20"/>
+        </w:rPr>
+        <w:t xml:space="preserve">· </w:t>
+      </w:r>
+      <w:r>
+        <w:rPr>
+          <w:rFonts w:ascii="Arial" w:cs="Arial" w:eastAsia="Arial" w:hAnsi="Arial"/>
+          <w:color w:val="1A1A1A"/>
+          <w:sz w:val="19"/>
+          <w:szCs w:val="19"/>
+        </w:rPr>
+        <w:t xml:space="preserve">Qualitätssicherung und Prozessabläufe in der Produktion</w:t>
       </w:r>
     </w:p>
     <w:p>

</xml_diff>